<commit_message>
Citas del estudio agudo (congreso SAIC-SAB 2023 y manuscrito de Marchena), IDA de la stevia (EFSA), ENNyS 2 con URL oficial y Bhatt corregido a Margolis y Gabard-Durnam
Co-Authored-By: Claude Opus 5.5 <noreply@anthropic.com>
</commit_message>
<xml_diff>
--- a/entregas/metodos resultados discusion 20261021.docx
+++ b/entregas/metodos resultados discusion 20261021.docx
@@ -15449,7 +15449,93 @@
         <w:pStyle w:val="FirstParagraph"/>
       </w:pPr>
       <w:r>
-        <w:t xml:space="preserve">Durante el tratamiento, los animales juveniles consumieron, en relación con su peso corporal, más del doble de solución endulzada que los adultos, tanto de sacarosa como de stevia (§5.1.1). Sin embargo, el índice de preferencia no presentó diferencias significativas entre edades, lo que indica que esta mayor ingesta relativa no estuvo acompañada de una mayor preferencia por el sabor dulce. En consecuencia, a pesar de presentar una preferencia comparable por las soluciones endulzadas, los animales juveniles consumieron cantidades considerablemente superiores de sacarosa y de stevia por unidad de peso corporal que los adultos. Asimismo, la ingesta de ambos edulcorantes superó los valores diarios de referencia correspondientes, y este exceso fue más pronunciado durante la etapa juvenil</w:t>
+        <w:t xml:space="preserve">Durante el tratamiento, los animales juveniles consumieron, en relación con su peso corporal, más del doble de solución endulzada que los adultos, tanto de sacarosa como de stevia (§5.1.1). Sin embargo, el índice de preferencia no presentó diferencias significativas entre edades, lo que indica que esta mayor ingesta relativa no estuvo acompañada de una mayor preferencia por el sabor dulce. En consecuencia, a pesar de presentar una preferencia comparable por las soluciones endulzadas, los animales juveniles consumieron cantidades considerablemente superiores de sacarosa y de stevia por unidad de peso corporal que los adultos. Asimismo, la ingesta de stevia superó la ingesta diaria admisible de glucósidos de esteviol, de 4 mg/kg de peso corporal por día expresada como equivalentes de esteviol [19], y este exceso fue más pronunciado durante la etapa juvenil. Según la composición del extracto (Tabla 4.1, con los factores de conversión a esteviol de 0,40 para el esteviósido y de 0,33 para los rebaudiósidos A y C [19]), la bebida al 4 % contenía alrededor de 0,08 mg/mL de equivalentes de esteviol; con un consumo medio de 0,24 y 0,09 mL/g de peso corporal por día, los animales juveniles ingirieron alrededor de 20 mg/kg/día (unas cinco veces la ingesta diaria admisible) y los adultos, alrededor de 7 mg/kg/día (1,8 veces).</w:t>
+      </w:r>
+    </w:p>
+    <w:p>
+      <w:pPr>
+        <w:pStyle w:val="BodyText"/>
+      </w:pPr>
+      <w:r>
+        <w:t xml:space="preserve">Los animales prefirieron la sacarosa más que la stevia en ambas edades. Este resultado es compatible con la propuesta de que el sabor dulce disociado del aporte calórico se procesa de forma distinta en los circuitos de recompensa [20], y con el hallazgo de que el consumo de stevia aumenta la expresión de ΔFosB, un marcador de activación sostenida, en el núcleo accumbens, el caudado-putamen y la corteza prefrontal, regiones del sistema de recompensa; en ese trabajo, la cría en un ambiente enriquecido redujo tanto el consumo de stevia como ese aumento de ΔFosB [21]. Una menor preferencia por la solución no calórica puede considerarse un aspecto favorable de la stevia, ya que sugiere un menor potencial para promover un consumo excesivo; de hecho, los animales consumieron menos stevia que sacarosa en ambas ventanas de edad (§5.1.1).</w:t>
+      </w:r>
+    </w:p>
+    <w:p>
+      <w:pPr>
+        <w:pStyle w:val="BodyText"/>
+      </w:pPr>
+      <w:r>
+        <w:t xml:space="preserve">Una vez retirados los edulcorantes, solo los animales expuestos durante la etapa juvenil modificaron su consumo de agua (§5.1.2). Los juveniles expuestos a sacarosa bebieron menos agua que su control de edad durante las primeras dos semanas, aunque la diferencia no alcanzó la significancia, y luego se aproximaron a los valores del control. Este comportamiento se asocia con frustración, como fue descripto previamente por el laboratorio [1]. Por el contrario, los juveniles expuestos a stevia bebieron menos agua que su control de edad durante los primeros nueve días, y más entre los días 11 y 25. Por otro lado, los adultos expuestos a stevia o a sacarosa no presentaron diferencias respecto de su control de edad en ningún momento, lo que refuerza la mayor sensibilidad de la ventana juvenil.</w:t>
+      </w:r>
+    </w:p>
+    <w:bookmarkEnd w:id="84"/>
+    <w:bookmarkStart w:id="85" w:name="Xbe6db9f52668e63da41a503be782c14d7927980"/>
+    <w:p>
+      <w:pPr>
+        <w:pStyle w:val="Heading2"/>
+      </w:pPr>
+      <w:r>
+        <w:t xml:space="preserve">6.3 Conducta tipo ansiosa y exploración en el</w:t>
+      </w:r>
+      <w:r>
+        <w:t xml:space="preserve"> </w:t>
+      </w:r>
+      <w:r>
+        <w:rPr>
+          <w:iCs/>
+          <w:i/>
+        </w:rPr>
+        <w:t xml:space="preserve">open field</w:t>
+      </w:r>
+    </w:p>
+    <w:p>
+      <w:pPr>
+        <w:pStyle w:val="FirstParagraph"/>
+      </w:pPr>
+      <w:r>
+        <w:t xml:space="preserve">En el</w:t>
+      </w:r>
+      <w:r>
+        <w:t xml:space="preserve"> </w:t>
+      </w:r>
+      <w:r>
+        <w:rPr>
+          <w:iCs/>
+          <w:i/>
+        </w:rPr>
+        <w:t xml:space="preserve">open field</w:t>
+      </w:r>
+      <w:r>
+        <w:t xml:space="preserve">, los animales expuestos a sacarosa durante la etapa juvenil ingresaron menos veces a las zonas centrales, recorrieron en ellas menor distancia, visitaron menos zonas y realizaron menos</w:t>
+      </w:r>
+      <w:r>
+        <w:t xml:space="preserve"> </w:t>
+      </w:r>
+      <w:r>
+        <w:rPr>
+          <w:iCs/>
+          <w:i/>
+        </w:rPr>
+        <w:t xml:space="preserve">rearing</w:t>
+      </w:r>
+      <w:r>
+        <w:t xml:space="preserve">, mientras que los expuestos a sacarosa durante la adultez no difirieron de su control (§5.2), lo que indica que el consumo temprano de una bebida azucarada promueve un perfil ansioso a largo plazo, como fue descripto anteriormente [1].</w:t>
+      </w:r>
+    </w:p>
+    <w:p>
+      <w:pPr>
+        <w:pStyle w:val="BodyText"/>
+      </w:pPr>
+      <w:r>
+        <w:t xml:space="preserve">A pesar de que no se registraron diferencias en la distancia total recorrida entre los grupos, los animales que bebieron stevia visitaron más zonas que sus controles de edad y que los grupos expuestos a sacarosa. Principalmente, los animales expuestos a stevia ingresaron más veces a las zonas centrales y recorrieron en ellas mayor distancia que el resto de los grupos, independientemente de la edad en la que se produjo el consumo.</w:t>
+      </w:r>
+    </w:p>
+    <w:p>
+      <w:pPr>
+        <w:pStyle w:val="BodyText"/>
+      </w:pPr>
+      <w:r>
+        <w:t xml:space="preserve">Estudios previos del laboratorio mostraron que el consumo temprano de stevia (decocción al 0,5 % v/v) no produce cambios en la conducta tipo ansiosa de ratas macho juveniles cuando se evalúa a corto plazo, al finalizar la exposición [22, 23]</w:t>
       </w:r>
       <w:r>
         <w:t xml:space="preserve"> </w:t>
@@ -15459,10 +15545,26 @@
           <w:bCs/>
           <w:b/>
         </w:rPr>
-        <w:t xml:space="preserve">[CONFIRMAR: agregar la referencia de los valores diarios y el cálculo de la ingesta]</w:t>
-      </w:r>
-      <w:r>
-        <w:t xml:space="preserve">.</w:t>
+        <w:t xml:space="preserve">[CONFIRMAR: coautores y revista del manuscrito de Marchena et al.]</w:t>
+      </w:r>
+      <w:r>
+        <w:t xml:space="preserve">. Esto sugiere que la abstinencia de la bebida endulzada con stevia, algunas alteraciones neurobiológicas, o ambas, serían responsables de los cambios a largo plazo en la conducta de tipo ansioso. Lo mismo ocurre con la sacarosa, cuyos efectos sobre la conducta tipo ansiosa evaluados a corto plazo [6, 24] difieren de los descriptos a largo plazo [1]. De manera similar, en ratas macho con acceso a stevia durante la adolescencia y evaluadas al finalizar el consumo, la stevia aumentó la locomoción en el</w:t>
+      </w:r>
+      <w:r>
+        <w:t xml:space="preserve"> </w:t>
+      </w:r>
+      <w:r>
+        <w:rPr>
+          <w:iCs/>
+          <w:i/>
+        </w:rPr>
+        <w:t xml:space="preserve">open field</w:t>
+      </w:r>
+      <w:r>
+        <w:t xml:space="preserve"> </w:t>
+      </w:r>
+      <w:r>
+        <w:t xml:space="preserve">[25], mientras que en este trabajo, a largo plazo, no modificó la distancia total recorrida y aumentó la exploración de las zonas centrales. Por otra parte, resultados previos del laboratorio demostraron que la exposición temprana al mismo extracto acuoso en ratas hembra juveniles disminuye las conductas de tipo ansioso en el laberinto en cruz elevado [3]. Estos hallazgos sugieren la existencia de diferencias sexuales en la respuesta conductual al extracto. En este contexto, sería de interés investigar si los efectos ansiolíticos observados en las hembras persisten a largo plazo y si la edad de exposición influye en su magnitud y persistencia.</w:t>
       </w:r>
     </w:p>
     <w:p>
@@ -15470,122 +15572,7 @@
         <w:pStyle w:val="BodyText"/>
       </w:pPr>
       <w:r>
-        <w:t xml:space="preserve">Los animales prefirieron la sacarosa más que la stevia en ambas edades. Este resultado es compatible con la propuesta de que el sabor dulce disociado del aporte calórico se procesa de forma distinta en los circuitos de recompensa [19], y con el hallazgo de que el consumo de stevia aumenta la expresión de ΔFosB, un marcador de activación sostenida, en el núcleo accumbens, el caudado-putamen y la corteza prefrontal, regiones del sistema de recompensa; en ese trabajo, la cría en un ambiente enriquecido redujo tanto el consumo de stevia como ese aumento de ΔFosB [20]. Una menor preferencia por la solución no calórica puede considerarse un aspecto favorable de la stevia, ya que sugiere un menor potencial para promover un consumo excesivo; de hecho, los animales consumieron menos stevia que sacarosa en ambas ventanas de edad (§5.1.1).</w:t>
-      </w:r>
-    </w:p>
-    <w:p>
-      <w:pPr>
-        <w:pStyle w:val="BodyText"/>
-      </w:pPr>
-      <w:r>
-        <w:t xml:space="preserve">Una vez retirados los edulcorantes, solo los animales expuestos durante la etapa juvenil modificaron su consumo de agua (§5.1.2). Los juveniles expuestos a sacarosa bebieron menos agua que su control de edad durante las primeras dos semanas, aunque la diferencia no alcanzó la significancia, y luego se aproximaron a los valores del control. Este comportamiento se asocia con frustración, como fue descripto previamente por el laboratorio [1]. Por el contrario, los juveniles expuestos a stevia bebieron menos agua que su control de edad durante los primeros nueve días, y más entre los días 11 y 25. Por otro lado, los adultos expuestos a stevia o a sacarosa no presentaron diferencias respecto de su control de edad en ningún momento, lo que refuerza la mayor sensibilidad de la ventana juvenil.</w:t>
-      </w:r>
-    </w:p>
-    <w:bookmarkEnd w:id="84"/>
-    <w:bookmarkStart w:id="85" w:name="Xbe6db9f52668e63da41a503be782c14d7927980"/>
-    <w:p>
-      <w:pPr>
-        <w:pStyle w:val="Heading2"/>
-      </w:pPr>
-      <w:r>
-        <w:t xml:space="preserve">6.3 Conducta tipo ansiosa y exploración en el</w:t>
-      </w:r>
-      <w:r>
-        <w:t xml:space="preserve"> </w:t>
-      </w:r>
-      <w:r>
-        <w:rPr>
-          <w:iCs/>
-          <w:i/>
-        </w:rPr>
-        <w:t xml:space="preserve">open field</w:t>
-      </w:r>
-    </w:p>
-    <w:p>
-      <w:pPr>
-        <w:pStyle w:val="FirstParagraph"/>
-      </w:pPr>
-      <w:r>
-        <w:t xml:space="preserve">En el</w:t>
-      </w:r>
-      <w:r>
-        <w:t xml:space="preserve"> </w:t>
-      </w:r>
-      <w:r>
-        <w:rPr>
-          <w:iCs/>
-          <w:i/>
-        </w:rPr>
-        <w:t xml:space="preserve">open field</w:t>
-      </w:r>
-      <w:r>
-        <w:t xml:space="preserve">, los animales expuestos a sacarosa durante la etapa juvenil ingresaron menos veces a las zonas centrales, recorrieron en ellas menor distancia, visitaron menos zonas y realizaron menos</w:t>
-      </w:r>
-      <w:r>
-        <w:t xml:space="preserve"> </w:t>
-      </w:r>
-      <w:r>
-        <w:rPr>
-          <w:iCs/>
-          <w:i/>
-        </w:rPr>
-        <w:t xml:space="preserve">rearing</w:t>
-      </w:r>
-      <w:r>
-        <w:t xml:space="preserve">, mientras que los expuestos a sacarosa durante la adultez no difirieron de su control (§5.2), lo que indica que el consumo temprano de una bebida azucarada promueve un perfil ansioso a largo plazo, como fue descripto anteriormente [1].</w:t>
-      </w:r>
-    </w:p>
-    <w:p>
-      <w:pPr>
-        <w:pStyle w:val="BodyText"/>
-      </w:pPr>
-      <w:r>
-        <w:t xml:space="preserve">A pesar de que no se registraron diferencias en la distancia total recorrida entre los grupos, los animales que bebieron stevia visitaron más zonas que sus controles de edad y que los grupos expuestos a sacarosa. Principalmente, los animales expuestos a stevia ingresaron más veces a las zonas centrales y recorrieron en ellas mayor distancia que el resto de los grupos, independientemente de la edad en la que se produjo el consumo.</w:t>
-      </w:r>
-    </w:p>
-    <w:p>
-      <w:pPr>
-        <w:pStyle w:val="BodyText"/>
-      </w:pPr>
-      <w:r>
-        <w:t xml:space="preserve">Estudios previos del laboratorio mostraron que el consumo temprano de stevia no produce cambios en la conducta tipo ansiosa de ratas macho juveniles cuando se evalúa a corto plazo</w:t>
-      </w:r>
-      <w:r>
-        <w:t xml:space="preserve"> </w:t>
-      </w:r>
-      <w:r>
-        <w:rPr>
-          <w:bCs/>
-          <w:b/>
-        </w:rPr>
-        <w:t xml:space="preserve">[CONFIRMAR: cita: manuscrito enviado para publicación y presentación a congreso]</w:t>
-      </w:r>
-      <w:r>
-        <w:t xml:space="preserve">. Esto sugiere que la abstinencia de la bebida endulzada con stevia, algunas alteraciones neurobiológicas, o ambas, serían responsables de los cambios a largo plazo en la conducta de tipo ansioso. Lo mismo ocurre con la sacarosa, cuyos efectos sobre la conducta tipo ansiosa evaluados a corto plazo [6, 21] difieren de los descriptos a largo plazo [1]. De manera similar, en ratas macho con acceso a stevia durante la adolescencia y evaluadas al finalizar el consumo, la stevia aumentó la locomoción en el</w:t>
-      </w:r>
-      <w:r>
-        <w:t xml:space="preserve"> </w:t>
-      </w:r>
-      <w:r>
-        <w:rPr>
-          <w:iCs/>
-          <w:i/>
-        </w:rPr>
-        <w:t xml:space="preserve">open field</w:t>
-      </w:r>
-      <w:r>
-        <w:t xml:space="preserve"> </w:t>
-      </w:r>
-      <w:r>
-        <w:t xml:space="preserve">[22], mientras que en este trabajo, a largo plazo, no modificó la distancia total recorrida y aumentó la exploración de las zonas centrales. Por otra parte, resultados previos del laboratorio demostraron que la exposición temprana al mismo extracto acuoso en ratas hembra juveniles disminuye las conductas de tipo ansioso en el laberinto en cruz elevado [3]. Estos hallazgos sugieren la existencia de diferencias sexuales en la respuesta conductual al extracto. En este contexto, sería de interés investigar si los efectos ansiolíticos observados en las hembras persisten a largo plazo y si la edad de exposición influye en su magnitud y persistencia.</w:t>
-      </w:r>
-    </w:p>
-    <w:p>
-      <w:pPr>
-        <w:pStyle w:val="BodyText"/>
-      </w:pPr>
-      <w:r>
-        <w:t xml:space="preserve">Estos resultados están en línea con los que demuestran efectos ansiolíticos de la stevia en ratas diabéticas [23]. Los animales expuestos a stevia realizaron, además, menos</w:t>
+        <w:t xml:space="preserve">Estos resultados están en línea con los que demuestran efectos ansiolíticos de la stevia en ratas diabéticas [26]. Los animales expuestos a stevia realizaron, además, menos</w:t>
       </w:r>
       <w:r>
         <w:t xml:space="preserve"> </w:t>
@@ -15648,20 +15635,7 @@
         <w:t xml:space="preserve">open field</w:t>
       </w:r>
       <w:r>
-        <w:t xml:space="preserve">, estudios previos del laboratorio indican que el consumo agudo de stevia durante la etapa juvenil no produce alteraciones en la memoria de reconocimiento a corto plazo</w:t>
-      </w:r>
-      <w:r>
-        <w:t xml:space="preserve"> </w:t>
-      </w:r>
-      <w:r>
-        <w:rPr>
-          <w:bCs/>
-          <w:b/>
-        </w:rPr>
-        <w:t xml:space="preserve">[CONFIRMAR: cita: manuscrito enviado para publicación y presentación a congreso]</w:t>
-      </w:r>
-      <w:r>
-        <w:t xml:space="preserve">. Además, estos animales presentaron modificaciones en la expresión de calretinina (CR), un marcador de determinadas poblaciones de interneuronas GABAérgicas, en la corteza prefrontal medial. Las interneuronas que expresan parvalbúmina (PV) y CR son importantes reguladoras de la actividad de los circuitos neuronales y desempeñan funciones relevantes en procesos cognitivos como la memoria y la sincronización de las redes neuronales [24, 25]. En este sentido, estudios previos demostraron que la disminución de la expresión de PV en el hipocampo y en la corteza prefrontal tras el consumo de sacarosa se asocia con alteraciones de la memoria y de las conductas de tipo ansioso [1, 26–28]. Considerando estos antecedentes, sería de interés investigar si las modificaciones en la expresión de CR tras el consumo juvenil de stevia persisten hasta la edad adulta y si se relacionan con las alteraciones de la memoria de reconocimiento observadas a largo plazo.</w:t>
+        <w:t xml:space="preserve">, estudios previos del laboratorio indican que el consumo agudo de stevia durante la etapa juvenil no produce alteraciones en la memoria de localización de objetos (prueba NOL), una memoria dependiente del hipocampo [22, 23]. Además, estos animales presentaron modificaciones en la expresión de calretinina (CR), un marcador de determinadas poblaciones de interneuronas GABAérgicas, en la corteza prefrontal medial [23]. Las interneuronas que expresan parvalbúmina (PV) y CR son importantes reguladoras de la actividad de los circuitos neuronales y desempeñan funciones relevantes en procesos cognitivos como la memoria y la sincronización de las redes neuronales [27, 28]. En este sentido, estudios previos demostraron que la disminución de la expresión de PV en el hipocampo y en la corteza prefrontal tras el consumo de sacarosa se asocia con alteraciones de la memoria y de las conductas de tipo ansioso [1, 29–31]. Considerando estos antecedentes, sería de interés investigar si las modificaciones en la expresión de CR tras el consumo juvenil de stevia persisten hasta la edad adulta y si se relacionan con las alteraciones de la memoria de reconocimiento observadas a largo plazo.</w:t>
       </w:r>
     </w:p>
     <w:p>
@@ -15669,7 +15643,7 @@
         <w:pStyle w:val="BodyText"/>
       </w:pPr>
       <w:r>
-        <w:t xml:space="preserve">Son escasos los trabajos que evaluaron los efectos de la stevia sobre la memoria a largo plazo, es decir, después de finalizado el consumo. La mayoría la evaluó mientras los animales aún consumían el edulcorante, con resultados dispares. Morales-Ríos et al. encontraron que el consumo de stevia durante 18 semanas alteró la memoria a largo plazo en el NOR de ratas macho adultas [29]. En cambio, Tsan et al., que administraron edulcorantes de bajas calorías (acesulfamo de potasio, sacarina o stevia) desde la etapa juvenil y evaluaron la memoria dependiente del hipocampo durante el período de consumo, describieron un deterioro al analizar los tres edulcorantes en conjunto, pero no al analizar la stevia por separado [30]. A largo plazo, solo se describió que el consumo materno de stevia durante la gestación y la lactancia se asocia con un peor desempeño de memoria en la descendencia macho adulta [31]. Este trabajo aporta, por lo tanto, evidencia de que el consumo de stevia en la etapa juvenil o en la adultez produce alteraciones de la memoria de reconocimiento que persisten después de finalizado el consumo, aunque más limitadas que las de la sacarosa.</w:t>
+        <w:t xml:space="preserve">Son escasos los trabajos que evaluaron los efectos de la stevia sobre la memoria a largo plazo, es decir, después de finalizado el consumo. La mayoría la evaluó mientras los animales aún consumían el edulcorante, con resultados dispares. Morales-Ríos et al. encontraron que el consumo de stevia durante 18 semanas alteró la memoria a largo plazo en el NOR de ratas macho adultas [32]. En cambio, Tsan et al., que administraron edulcorantes de bajas calorías (acesulfamo de potasio, sacarina o stevia) desde la etapa juvenil y evaluaron la memoria dependiente del hipocampo durante el período de consumo, describieron un deterioro al analizar los tres edulcorantes en conjunto, pero no al analizar la stevia por separado [33]. A largo plazo, solo se describió que el consumo materno de stevia durante la gestación y la lactancia se asocia con un peor desempeño de memoria en la descendencia macho adulta [34]. Este trabajo aporta, por lo tanto, evidencia de que el consumo de stevia en la etapa juvenil o en la adultez produce alteraciones de la memoria de reconocimiento que persisten después de finalizado el consumo, aunque más limitadas que las de la sacarosa.</w:t>
       </w:r>
     </w:p>
     <w:p>
@@ -15677,7 +15651,7 @@
         <w:pStyle w:val="BodyText"/>
       </w:pPr>
       <w:r>
-        <w:t xml:space="preserve">A diferencia de esos estudios, que administraron la stevia en dosis cercanas a la ingesta diaria admisible, aquí se administró un extracto acuoso de hojas que contiene, además de glucósidos de esteviol, compuestos fenólicos y flavonoides con actividad antioxidante (Tabla 4.1). La stevia redujo los marcadores de estrés oxidativo cerebral en ratas alimentadas con una dieta alta en grasas y sacarosa [32], y los glucósidos de esteviol presentan actividad antioxidante [33], revirtieron el deterioro de la memoria inducido por escopolamina [34] y modularon la plasticidad sináptica hipocampal en un modelo de desorden metabólico [35]. Estas propiedades podrían contribuir a que la stevia no produjera un deterioro sostenido de la memoria de reconocimiento.</w:t>
+        <w:t xml:space="preserve">A diferencia de esos estudios, que administraron la stevia en dosis cercanas a la ingesta diaria admisible, aquí se administró un extracto acuoso de hojas que contiene, además de glucósidos de esteviol, compuestos fenólicos y flavonoides con actividad antioxidante (Tabla 4.1). La stevia redujo los marcadores de estrés oxidativo cerebral en ratas alimentadas con una dieta alta en grasas y sacarosa [35], y los glucósidos de esteviol presentan actividad antioxidante [36], revirtieron el deterioro de la memoria inducido por escopolamina [37] y modularon la plasticidad sináptica hipocampal en un modelo de desorden metabólico [38]. Estas propiedades podrían contribuir a que la stevia no produjera un deterioro sostenido de la memoria de reconocimiento.</w:t>
       </w:r>
     </w:p>
     <w:bookmarkEnd w:id="86"/>
@@ -15695,7 +15669,7 @@
         <w:pStyle w:val="FirstParagraph"/>
       </w:pPr>
       <w:r>
-        <w:t xml:space="preserve">En la SLR, los animales expuestos a sacarosa durante la etapa juvenil discriminaron peor la posición novedosa en ambas configuraciones, mientras que los expuestos durante la adultez lo hicieron solo en la s-SLR, la configuración de mayor demanda de separación de patrones (§5.4). Este patrón concuerda con el de Reichelt et al., quienes encontraron que las ratas con acceso diario a sacarosa discriminaron la nueva ubicación de un objeto cuando la separación espacial era grande, pero no cuando era pequeña [11]. También concuerda con la alteración selectiva de la memoria de lugar descripta tras una exposición breve a azúcar [36, 37] y con el deterioro de la separación de patrones asociado a una menor neurogénesis tras una alteración nutricional temprana [9]. Que en los adultos el déficit apareciera solo en la configuración más exigente sugiere que la exposición adulta a sacarosa compromete específicamente la separación de patrones, mientras que la exposición juvenil produce una alteración más amplia de la memoria espacial.</w:t>
+        <w:t xml:space="preserve">En la SLR, los animales expuestos a sacarosa durante la etapa juvenil discriminaron peor la posición novedosa en ambas configuraciones, mientras que los expuestos durante la adultez lo hicieron solo en la s-SLR, la configuración de mayor demanda de separación de patrones (§5.4). Este patrón concuerda con el de Reichelt et al., quienes encontraron que las ratas con acceso diario a sacarosa discriminaron la nueva ubicación de un objeto cuando la separación espacial era grande, pero no cuando era pequeña [11]. También concuerda con la alteración selectiva de la memoria de lugar descripta tras una exposición breve a azúcar [39, 40] y con el deterioro de la separación de patrones asociado a una menor neurogénesis tras una alteración nutricional temprana [9]. Que en los adultos el déficit apareciera solo en la configuración más exigente sugiere que la exposición adulta a sacarosa compromete específicamente la separación de patrones, mientras que la exposición juvenil produce una alteración más amplia de la memoria espacial.</w:t>
       </w:r>
     </w:p>
     <w:p>
@@ -15753,7 +15727,7 @@
         <w:t xml:space="preserve"> </w:t>
       </w:r>
       <w:r>
-        <w:t xml:space="preserve">(§5.5). Estos resultados indican que la sacarosa afecta la etapa proliferativa del linaje neuronal [38] y que esa alteración persiste 25 días después de finalizado el consumo. Reichelt et al. también encontraron menos células PCNA</w:t>
+        <w:t xml:space="preserve">(§5.5). Estos resultados indican que la sacarosa afecta la etapa proliferativa del linaje neuronal [41] y que esa alteración persiste 25 días después de finalizado el consumo. Reichelt et al. también encontraron menos células PCNA</w:t>
       </w:r>
       <w:r>
         <w:rPr>
@@ -15789,7 +15763,7 @@
         <w:t xml:space="preserve"> </w:t>
       </w:r>
       <w:r>
-        <w:t xml:space="preserve">no se modificó, como en el trabajo de Xu y Reichelt, en el que la sacarosa sola no modificó la DCX del giro dentado [27]; esto podría indicar que, a largo plazo, la alteración se restringe a la etapa proliferativa. Además, en ratas hembra, el consumo de sacarosa al 25 % durante doce semanas a partir del destete redujo la expresión hipocampal de</w:t>
+        <w:t xml:space="preserve">no se modificó, como en el trabajo de Xu y Reichelt, en el que la sacarosa sola no modificó la DCX del giro dentado [30]; esto podría indicar que, a largo plazo, la alteración se restringe a la etapa proliferativa. Además, en ratas hembra, el consumo de sacarosa al 25 % durante doce semanas a partir del destete redujo la expresión hipocampal de</w:t>
       </w:r>
       <w:r>
         <w:t xml:space="preserve"> </w:t>
@@ -15802,7 +15776,7 @@
         <w:t xml:space="preserve">Neurod1</w:t>
       </w:r>
       <w:r>
-        <w:t xml:space="preserve">, un gen vinculado a la diferenciación neuronal [39]. En cambio, Sánchez-Huerta et al. encontraron un aumento de la proliferación en la zona subgranular del giro dentado ventral tras el consumo de sacarosa iniciado en la adolescencia tardía [21], lo que sugiere que el efecto sobre la proliferación depende de la edad de inicio de la exposición.</w:t>
+        <w:t xml:space="preserve">, un gen vinculado a la diferenciación neuronal [42]. En cambio, Sánchez-Huerta et al. encontraron un aumento de la proliferación en la zona subgranular del giro dentado ventral tras el consumo de sacarosa iniciado en la adolescencia tardía [24], lo que sugiere que el efecto sobre la proliferación depende de la edad de inicio de la exposición.</w:t>
       </w:r>
     </w:p>
     <w:p>
@@ -15844,7 +15818,7 @@
         <w:t xml:space="preserve"> </w:t>
       </w:r>
       <w:r>
-        <w:t xml:space="preserve">(§6.3). Ni el clustering ni el clasificador encontraron grupos conductuales separados, y la exactitud del clasificador, superior al azar pero modesta, es la esperable para una intervención nutricional: en los trabajos que aplicaron Random Forest al fenotipado conductual, los grupos diferían por manipulaciones farmacológicas o genéticas de gran efecto [40, 41].</w:t>
+        <w:t xml:space="preserve">(§6.3). Ni el clustering ni el clasificador encontraron grupos conductuales separados, y la exactitud del clasificador, superior al azar pero modesta, es la esperable para una intervención nutricional: en los trabajos que aplicaron Random Forest al fenotipado conductual, los grupos diferían por manipulaciones farmacológicas o genéticas de gran efecto [43, 44].</w:t>
       </w:r>
     </w:p>
     <w:bookmarkEnd w:id="88"/>
@@ -16779,7 +16753,7 @@
         <w:rPr>
           <w:sz w:val="19"/>
         </w:rPr>
-        <w:t xml:space="preserve">[19] A. G. Yunker, R. Patel, and K. A. Page,</w:t>
+        <w:t xml:space="preserve">[19] EFSA Panel on Food Additives and Nutrient Sources added to Food (ANS),</w:t>
       </w:r>
       <w:r>
         <w:rPr>
@@ -16797,7 +16771,7 @@
         <w:rPr>
           <w:sz w:val="19"/>
         </w:rPr>
-        <w:t xml:space="preserve">Effects of non-nutritive sweeteners on sweet taste processing and neuroendocrine regulation of eating behavior,</w:t>
+        <w:t xml:space="preserve">Scientific opinion on the safety of steviol glycosides for the proposed uses as a food additive,</w:t>
       </w:r>
       <w:r>
         <w:rPr>
@@ -16815,7 +16789,7 @@
         <w:rPr>
           <w:sz w:val="19"/>
         </w:rPr>
-        <w:t xml:space="preserve">Curr. Nutr. Rep., vol. 9, no. 3, pp. 278–289, Sep. 2020. doi: 10.1007/s13668-020-00323-3 [Online]. Available: https://pubmed.ncbi.nlm.nih.gov/32588329/</w:t>
+        <w:t xml:space="preserve">EFSA J., vol. 8, no. 4, 2010, Art. no. 1537. doi: 10.2903/j.efsa.2010.1537</w:t>
       </w:r>
     </w:p>
     <w:p>
@@ -16828,7 +16802,7 @@
         <w:rPr>
           <w:sz w:val="19"/>
         </w:rPr>
-        <w:t xml:space="preserve">[20] I. D. Salinas-Velarde et al.,</w:t>
+        <w:t xml:space="preserve">[20] A. G. Yunker, R. Patel, and K. A. Page,</w:t>
       </w:r>
       <w:r>
         <w:rPr>
@@ -16846,7 +16820,7 @@
         <w:rPr>
           <w:sz w:val="19"/>
         </w:rPr>
-        <w:t xml:space="preserve">Lower ΔFosB expression in the dopaminergic system after stevia consumption in rats housed under environmental enrichment conditions,</w:t>
+        <w:t xml:space="preserve">Effects of non-nutritive sweeteners on sweet taste processing and neuroendocrine regulation of eating behavior,</w:t>
       </w:r>
       <w:r>
         <w:rPr>
@@ -16864,7 +16838,7 @@
         <w:rPr>
           <w:sz w:val="19"/>
         </w:rPr>
-        <w:t xml:space="preserve">Brain Res. Bull., vol. 177, pp. 172–180, 2021. doi: 10.1016/j.brainresbull.2021.10.001</w:t>
+        <w:t xml:space="preserve">Curr. Nutr. Rep., vol. 9, no. 3, pp. 278–289, Sep. 2020. doi: 10.1007/s13668-020-00323-3 [Online]. Available: https://pubmed.ncbi.nlm.nih.gov/32588329/</w:t>
       </w:r>
     </w:p>
     <w:p>
@@ -16877,7 +16851,7 @@
         <w:rPr>
           <w:sz w:val="19"/>
         </w:rPr>
-        <w:t xml:space="preserve">[21] K. Sánchez-Huerta et al.,</w:t>
+        <w:t xml:space="preserve">[21] I. D. Salinas-Velarde et al.,</w:t>
       </w:r>
       <w:r>
         <w:rPr>
@@ -16895,7 +16869,7 @@
         <w:rPr>
           <w:sz w:val="19"/>
         </w:rPr>
-        <w:t xml:space="preserve">Sucrose consumption during late adolescence impairs adult neurogenesis of the ventral dentate gyrus without inducing an anxiety-like behavior,</w:t>
+        <w:t xml:space="preserve">Lower ΔFosB expression in the dopaminergic system after stevia consumption in rats housed under environmental enrichment conditions,</w:t>
       </w:r>
       <w:r>
         <w:rPr>
@@ -16913,7 +16887,7 @@
         <w:rPr>
           <w:sz w:val="19"/>
         </w:rPr>
-        <w:t xml:space="preserve">Int. J. Mol. Sci., vol. 23, no. 22, Nov. 2022, Art. no. 14176. doi: 10.3390/ijms232214176 [Online].Available: https://www.ncbi.nlm.nih.gov/pmc/articles/PMC9695980/</w:t>
+        <w:t xml:space="preserve">Brain Res. Bull., vol. 177, pp. 172–180, 2021. doi: 10.1016/j.brainresbull.2021.10.001</w:t>
       </w:r>
     </w:p>
     <w:p>
@@ -16926,7 +16900,7 @@
         <w:rPr>
           <w:sz w:val="19"/>
         </w:rPr>
-        <w:t xml:space="preserve">[22] J. L. Rico, L. Aya-Ramos, and Z. Dueñas,</w:t>
+        <w:t xml:space="preserve">[22] H. Coirini, M. Rey, A. Marchena, P. Lence, and M. S. Kruse,</w:t>
       </w:r>
       <w:r>
         <w:rPr>
@@ -16944,7 +16918,7 @@
         <w:rPr>
           <w:sz w:val="19"/>
         </w:rPr>
-        <w:t xml:space="preserve">Effects of early-life stress followed by access to stevia or sucralose during adolescence on weight gain, glycemia, and anxiety-related behaviors in male and female rats,</w:t>
+        <w:t xml:space="preserve">Stevia vs. sucrose consumption: influence on the behavior of juvenile rats,</w:t>
       </w:r>
       <w:r>
         <w:rPr>
@@ -16962,7 +16936,7 @@
         <w:rPr>
           <w:sz w:val="19"/>
         </w:rPr>
-        <w:t xml:space="preserve">Physiol. Behav., vol. 280, 2024, Art. no. 114529. doi: 10.1016/j.physbeh.2024.114529</w:t>
+        <w:t xml:space="preserve">Medicina (B. Aires), vol. 83, no. Supl. V, p. 148, 2023, Resumen 182, Reunión Conjunta SAIC SAB AAFE AACYTAL 2023, Mar del Plata, Argentina.</w:t>
       </w:r>
     </w:p>
     <w:p>
@@ -16975,7 +16949,7 @@
         <w:rPr>
           <w:sz w:val="19"/>
         </w:rPr>
-        <w:t xml:space="preserve">[23] F. Khakpai, M. Naseroleslami, M. Moheb-Alian, E. Ghanimati, F. Abdollah-pour, and N. Mousavi-Niri,</w:t>
+        <w:t xml:space="preserve">[23] A. Marchena et al.,</w:t>
       </w:r>
       <w:r>
         <w:rPr>
@@ -16993,7 +16967,7 @@
         <w:rPr>
           <w:sz w:val="19"/>
         </w:rPr>
-        <w:t xml:space="preserve">Intra-gastrically administration of Stevia and particularly Nano-Stevia reversed the hyperglycemia, anxiety, and memory impairment in streptozotocin-induced diabetic rats,</w:t>
+        <w:t xml:space="preserve">Early-life stevia and sucrose consumption differentially affect metabolic homeostasis and neurobiological outcomes in rats,</w:t>
       </w:r>
       <w:r>
         <w:rPr>
@@ -17011,7 +16985,7 @@
         <w:rPr>
           <w:sz w:val="19"/>
         </w:rPr>
-        <w:t xml:space="preserve">Physiol. Behav., vol. 263, 2023, Art. no. 114100. doi: 10.1016/j.physbeh.2023.114100</w:t>
+        <w:t xml:space="preserve">Manuscrito enviado para publicación.</w:t>
       </w:r>
     </w:p>
     <w:p>
@@ -17024,7 +16998,7 @@
         <w:rPr>
           <w:sz w:val="19"/>
         </w:rPr>
-        <w:t xml:space="preserve">[24] D. Bosch and I. Ehrlich,</w:t>
+        <w:t xml:space="preserve">[24] K. Sánchez-Huerta et al.,</w:t>
       </w:r>
       <w:r>
         <w:rPr>
@@ -17042,7 +17016,7 @@
         <w:rPr>
           <w:sz w:val="19"/>
         </w:rPr>
-        <w:t xml:space="preserve">Postnatal maturation of GABAergic modulation of sensory inputs onto lateral amygdala principal neurons,</w:t>
+        <w:t xml:space="preserve">Sucrose consumption during late adolescence impairs adult neurogenesis of the ventral dentate gyrus without inducing an anxiety-like behavior,</w:t>
       </w:r>
       <w:r>
         <w:rPr>
@@ -17060,7 +17034,7 @@
         <w:rPr>
           <w:sz w:val="19"/>
         </w:rPr>
-        <w:t xml:space="preserve">J. Physiol., vol. 593, no. 19, pp. 4387–4409, 2015. doi: 10.1113/JP270645</w:t>
+        <w:t xml:space="preserve">Int. J. Mol. Sci., vol. 23, no. 22, Nov. 2022, Art. no. 14176. doi: 10.3390/ijms232214176 [Online].Available: https://www.ncbi.nlm.nih.gov/pmc/articles/PMC9695980/</w:t>
       </w:r>
     </w:p>
     <w:p>
@@ -17073,7 +17047,7 @@
         <w:rPr>
           <w:sz w:val="19"/>
         </w:rPr>
-        <w:t xml:space="preserve">[25] N. Ognjanovski et al.,</w:t>
+        <w:t xml:space="preserve">[25] J. L. Rico, L. Aya-Ramos, and Z. Dueñas,</w:t>
       </w:r>
       <w:r>
         <w:rPr>
@@ -17091,7 +17065,7 @@
         <w:rPr>
           <w:sz w:val="19"/>
         </w:rPr>
-        <w:t xml:space="preserve">Parvalbumin-expressing interneurons coordinate hippocampal network dynamics required for memory consolidation,</w:t>
+        <w:t xml:space="preserve">Effects of early-life stress followed by access to stevia or sucralose during adolescence on weight gain, glycemia, and anxiety-related behaviors in male and female rats,</w:t>
       </w:r>
       <w:r>
         <w:rPr>
@@ -17109,7 +17083,7 @@
         <w:rPr>
           <w:sz w:val="19"/>
         </w:rPr>
-        <w:t xml:space="preserve">Nat. Commun., vol. 8, 2017, Art. no. 15039. doi: 10.1038/ncomms15039</w:t>
+        <w:t xml:space="preserve">Physiol. Behav., vol. 280, 2024, Art. no. 114529. doi: 10.1016/j.physbeh.2024.114529</w:t>
       </w:r>
     </w:p>
     <w:p>
@@ -17122,7 +17096,7 @@
         <w:rPr>
           <w:sz w:val="19"/>
         </w:rPr>
-        <w:t xml:space="preserve">[26] A. C. Reichelt, S. Killcross, L. D. Hambly, M. J. Morris, and R. F. Westbrook,</w:t>
+        <w:t xml:space="preserve">[26] F. Khakpai, M. Naseroleslami, M. Moheb-Alian, E. Ghanimati, F. Abdollah-pour, and N. Mousavi-Niri,</w:t>
       </w:r>
       <w:r>
         <w:rPr>
@@ -17140,7 +17114,7 @@
         <w:rPr>
           <w:sz w:val="19"/>
         </w:rPr>
-        <w:t xml:space="preserve">Impact of adolescent sucrose access on cognitive control, recognition memory, and parvalbumin immunoreactivity,</w:t>
+        <w:t xml:space="preserve">Intra-gastrically administration of Stevia and particularly Nano-Stevia reversed the hyperglycemia, anxiety, and memory impairment in streptozotocin-induced diabetic rats,</w:t>
       </w:r>
       <w:r>
         <w:rPr>
@@ -17158,7 +17132,7 @@
         <w:rPr>
           <w:sz w:val="19"/>
         </w:rPr>
-        <w:t xml:space="preserve">Learn. Mem., vol. 22, no. 4, pp. 215–224, 2015. doi: 10.1101/lm.038000.114</w:t>
+        <w:t xml:space="preserve">Physiol. Behav., vol. 263, 2023, Art. no. 114100. doi: 10.1016/j.physbeh.2023.114100</w:t>
       </w:r>
     </w:p>
     <w:p>
@@ -17171,7 +17145,7 @@
         <w:rPr>
           <w:sz w:val="19"/>
         </w:rPr>
-        <w:t xml:space="preserve">[27] T. J. Xu and A. C. Reichelt,</w:t>
+        <w:t xml:space="preserve">[27] D. Bosch and I. Ehrlich,</w:t>
       </w:r>
       <w:r>
         <w:rPr>
@@ -17189,7 +17163,7 @@
         <w:rPr>
           <w:sz w:val="19"/>
         </w:rPr>
-        <w:t xml:space="preserve">Sucrose or sucrose and caffeine differentially impact memory and anxiety-like behaviours, and alter hippocampal parvalbumin and doublecortin,</w:t>
+        <w:t xml:space="preserve">Postnatal maturation of GABAergic modulation of sensory inputs onto lateral amygdala principal neurons,</w:t>
       </w:r>
       <w:r>
         <w:rPr>
@@ -17207,7 +17181,7 @@
         <w:rPr>
           <w:sz w:val="19"/>
         </w:rPr>
-        <w:t xml:space="preserve">Neuropharmacology, vol. 137, pp. 24–32, 2018. doi: 10.1016/j.neuropharm.2018.04.012</w:t>
+        <w:t xml:space="preserve">J. Physiol., vol. 593, no. 19, pp. 4387–4409, 2015. doi: 10.1113/JP270645</w:t>
       </w:r>
     </w:p>
     <w:p>
@@ -17220,7 +17194,7 @@
         <w:rPr>
           <w:sz w:val="19"/>
         </w:rPr>
-        <w:t xml:space="preserve">[28] A. C. Reichelt, G. D. Gibson, K. N. Abbott, and D. J. Hare,</w:t>
+        <w:t xml:space="preserve">[28] N. Ognjanovski et al.,</w:t>
       </w:r>
       <w:r>
         <w:rPr>
@@ -17238,7 +17212,7 @@
         <w:rPr>
           <w:sz w:val="19"/>
         </w:rPr>
-        <w:t xml:space="preserve">A high-fat high-sugar diet in adolescent rats impairs social memory and alters chemical markers characteristic of atypical neuroplasticity and parvalbumin interneuron depletion in the medial prefrontal cortex,</w:t>
+        <w:t xml:space="preserve">Parvalbumin-expressing interneurons coordinate hippocampal network dynamics required for memory consolidation,</w:t>
       </w:r>
       <w:r>
         <w:rPr>
@@ -17256,7 +17230,7 @@
         <w:rPr>
           <w:sz w:val="19"/>
         </w:rPr>
-        <w:t xml:space="preserve">Food Funct., vol. 10, no. 4, pp. 1985–1998, 2019. doi: 10.1039/c8fo02118j</w:t>
+        <w:t xml:space="preserve">Nat. Commun., vol. 8, 2017, Art. no. 15039. doi: 10.1038/ncomms15039</w:t>
       </w:r>
     </w:p>
     <w:p>
@@ -17269,7 +17243,7 @@
         <w:rPr>
           <w:sz w:val="19"/>
         </w:rPr>
-        <w:t xml:space="preserve">[29] E. I. Morales-Ríos, J. García-Machorro, A. Briones-Aranda, R. Gómez-Pliego, and J. Espinosa-Raya,</w:t>
+        <w:t xml:space="preserve">[29] A. C. Reichelt, S. Killcross, L. D. Hambly, M. J. Morris, and R. F. Westbrook,</w:t>
       </w:r>
       <w:r>
         <w:rPr>
@@ -17287,7 +17261,7 @@
         <w:rPr>
           <w:sz w:val="19"/>
         </w:rPr>
-        <w:t xml:space="preserve">Effect of long-term intake of nutritive and non-nutritive sweeteners on metabolic health and cognition in adult male rats,</w:t>
+        <w:t xml:space="preserve">Impact of adolescent sucrose access on cognitive control, recognition memory, and parvalbumin immunoreactivity,</w:t>
       </w:r>
       <w:r>
         <w:rPr>
@@ -17305,7 +17279,7 @@
         <w:rPr>
           <w:sz w:val="19"/>
         </w:rPr>
-        <w:t xml:space="preserve">J. Med. Food, vol. 25, no. 11, pp. 1059–1065, 2022. doi: 10.1089/jmf.2022.0016</w:t>
+        <w:t xml:space="preserve">Learn. Mem., vol. 22, no. 4, pp. 215–224, 2015. doi: 10.1101/lm.038000.114</w:t>
       </w:r>
     </w:p>
     <w:p>
@@ -17318,7 +17292,7 @@
         <w:rPr>
           <w:sz w:val="19"/>
         </w:rPr>
-        <w:t xml:space="preserve">[30] L. Tsan et al.,</w:t>
+        <w:t xml:space="preserve">[30] T. J. Xu and A. C. Reichelt,</w:t>
       </w:r>
       <w:r>
         <w:rPr>
@@ -17336,7 +17310,7 @@
         <w:rPr>
           <w:sz w:val="19"/>
         </w:rPr>
-        <w:t xml:space="preserve">Early-life low-calorie sweetener consumption disrupts glucose regulation, sugar-motivated behavior, and memory function in rats,</w:t>
+        <w:t xml:space="preserve">Sucrose or sucrose and caffeine differentially impact memory and anxiety-like behaviours, and alter hippocampal parvalbumin and doublecortin,</w:t>
       </w:r>
       <w:r>
         <w:rPr>
@@ -17354,7 +17328,7 @@
         <w:rPr>
           <w:sz w:val="19"/>
         </w:rPr>
-        <w:t xml:space="preserve">JCI Insight, vol. 7, no. 20, Oct. 2022, Art. no. e157714. doi: 10.1172/jci.insight.157714 [Online]. Available: https://www.ncbi.nlm.nih.gov/pmc/articles/PMC9714783/</w:t>
+        <w:t xml:space="preserve">Neuropharmacology, vol. 137, pp. 24–32, 2018. doi: 10.1016/j.neuropharm.2018.04.012</w:t>
       </w:r>
     </w:p>
     <w:p>
@@ -17367,7 +17341,7 @@
         <w:rPr>
           <w:sz w:val="19"/>
         </w:rPr>
-        <w:t xml:space="preserve">[31] A. L. de la Garza et al.,</w:t>
+        <w:t xml:space="preserve">[31] A. C. Reichelt, G. D. Gibson, K. N. Abbott, and D. J. Hare,</w:t>
       </w:r>
       <w:r>
         <w:rPr>
@@ -17385,7 +17359,7 @@
         <w:rPr>
           <w:sz w:val="19"/>
         </w:rPr>
-        <w:t xml:space="preserve">Maternal sweeteners intake modulates gut microbiota and exacerbates learning and memory processes in adult male offspring,</w:t>
+        <w:t xml:space="preserve">A high-fat high-sugar diet in adolescent rats impairs social memory and alters chemical markers characteristic of atypical neuroplasticity and parvalbumin interneuron depletion in the medial prefrontal cortex,</w:t>
       </w:r>
       <w:r>
         <w:rPr>
@@ -17403,7 +17377,7 @@
         <w:rPr>
           <w:sz w:val="19"/>
         </w:rPr>
-        <w:t xml:space="preserve">Front. Pediatr., vol. 9, Jan. 2022, Art. no. 746437. doi: 10.3389/fped.2021.746437</w:t>
+        <w:t xml:space="preserve">Food Funct., vol. 10, no. 4, pp. 1985–1998, 2019. doi: 10.1039/c8fo02118j</w:t>
       </w:r>
     </w:p>
     <w:p>
@@ -17416,7 +17390,7 @@
         <w:rPr>
           <w:sz w:val="19"/>
         </w:rPr>
-        <w:t xml:space="preserve">[32] Y. Pozdnyakova and A. Murzatayeva,</w:t>
+        <w:t xml:space="preserve">[32] E. I. Morales-Ríos, J. García-Machorro, A. Briones-Aranda, R. Gómez-Pliego, and J. Espinosa-Raya,</w:t>
       </w:r>
       <w:r>
         <w:rPr>
@@ -17434,7 +17408,7 @@
         <w:rPr>
           <w:sz w:val="19"/>
         </w:rPr>
-        <w:t xml:space="preserve">Neuroprotective potential of Stevia rebaudiana and Stachys sieboldii: Effects on oxidative stress and locomotor activity in male rats fed a high-fat, high-sucrose diet,</w:t>
+        <w:t xml:space="preserve">Effect of long-term intake of nutritive and non-nutritive sweeteners on metabolic health and cognition in adult male rats,</w:t>
       </w:r>
       <w:r>
         <w:rPr>
@@ -17452,7 +17426,7 @@
         <w:rPr>
           <w:sz w:val="19"/>
         </w:rPr>
-        <w:t xml:space="preserve">Biology (Basel), vol. 14, no. 4, Mar. 2025, Art. no. 359. doi: 10.3390/biology14040359 [Online]. Available: https://www.mdpi.com/2079-7737/14/4/359</w:t>
+        <w:t xml:space="preserve">J. Med. Food, vol. 25, no. 11, pp. 1059–1065, 2022. doi: 10.1089/jmf.2022.0016</w:t>
       </w:r>
     </w:p>
     <w:p>
@@ -17465,7 +17439,7 @@
         <w:rPr>
           <w:sz w:val="19"/>
         </w:rPr>
-        <w:t xml:space="preserve">[33] C. Prata et al.,</w:t>
+        <w:t xml:space="preserve">[33] L. Tsan et al.,</w:t>
       </w:r>
       <w:r>
         <w:rPr>
@@ -17483,7 +17457,7 @@
         <w:rPr>
           <w:sz w:val="19"/>
         </w:rPr>
-        <w:t xml:space="preserve">Glycosides from Stevia rebaudiana Bertoni possess insulin-mimetic and antioxidant activities in rat cardiac fibroblasts,</w:t>
+        <w:t xml:space="preserve">Early-life low-calorie sweetener consumption disrupts glucose regulation, sugar-motivated behavior, and memory function in rats,</w:t>
       </w:r>
       <w:r>
         <w:rPr>
@@ -17501,7 +17475,7 @@
         <w:rPr>
           <w:sz w:val="19"/>
         </w:rPr>
-        <w:t xml:space="preserve">Oxid. Med. Cell. Longev., vol. 2017, Aug. 2017, Art. no. 3724545. doi: 10.1155/2017/3724545 [Online]. Available: https://www.ncbi.nlm.nih.gov/pmc/articles/PMC5602648/</w:t>
+        <w:t xml:space="preserve">JCI Insight, vol. 7, no. 20, Oct. 2022, Art. no. e157714. doi: 10.1172/jci.insight.157714 [Online]. Available: https://www.ncbi.nlm.nih.gov/pmc/articles/PMC9714783/</w:t>
       </w:r>
     </w:p>
     <w:p>
@@ -17514,7 +17488,7 @@
         <w:rPr>
           <w:sz w:val="19"/>
         </w:rPr>
-        <w:t xml:space="preserve">[34] D. Sharma, M. Puri, A. K. Tiwary, N. Singh, and A. S. Jaggi,</w:t>
+        <w:t xml:space="preserve">[34] A. L. de la Garza et al.,</w:t>
       </w:r>
       <w:r>
         <w:rPr>
@@ -17532,7 +17506,7 @@
         <w:rPr>
           <w:sz w:val="19"/>
         </w:rPr>
-        <w:t xml:space="preserve">Antiamnesic effect of stevioside in scopolamine-treated rats,</w:t>
+        <w:t xml:space="preserve">Maternal sweeteners intake modulates gut microbiota and exacerbates learning and memory processes in adult male offspring,</w:t>
       </w:r>
       <w:r>
         <w:rPr>
@@ -17550,7 +17524,7 @@
         <w:rPr>
           <w:sz w:val="19"/>
         </w:rPr>
-        <w:t xml:space="preserve">Indian J. Pharmacol., vol. 42, no. 3, pp. 164–167, 2010. doi: 10.4103/0253-7613.66840</w:t>
+        <w:t xml:space="preserve">Front. Pediatr., vol. 9, Jan. 2022, Art. no. 746437. doi: 10.3389/fped.2021.746437</w:t>
       </w:r>
     </w:p>
     <w:p>
@@ -17563,7 +17537,7 @@
         <w:rPr>
           <w:sz w:val="19"/>
         </w:rPr>
-        <w:t xml:space="preserve">[35] V. A. Chavushyan et al.,</w:t>
+        <w:t xml:space="preserve">[35] Y. Pozdnyakova and A. Murzatayeva,</w:t>
       </w:r>
       <w:r>
         <w:rPr>
@@ -17581,7 +17555,7 @@
         <w:rPr>
           <w:sz w:val="19"/>
         </w:rPr>
-        <w:t xml:space="preserve">Effects of stevia on synaptic plasticity and NADPH oxidase level of CNS in conditions of metabolic disorders caused by fructose,</w:t>
+        <w:t xml:space="preserve">Neuroprotective potential of Stevia rebaudiana and Stachys sieboldii: Effects on oxidative stress and locomotor activity in male rats fed a high-fat, high-sucrose diet,</w:t>
       </w:r>
       <w:r>
         <w:rPr>
@@ -17599,7 +17573,7 @@
         <w:rPr>
           <w:sz w:val="19"/>
         </w:rPr>
-        <w:t xml:space="preserve">BMC Complement. Altern. Med., vol. 17, Dec. 2017, Art. no. 540. doi: 10.1186/s12906-017-2049-9</w:t>
+        <w:t xml:space="preserve">Biology (Basel), vol. 14, no. 4, Mar. 2025, Art. no. 359. doi: 10.3390/biology14040359 [Online]. Available: https://www.mdpi.com/2079-7737/14/4/359</w:t>
       </w:r>
     </w:p>
     <w:p>
@@ -17612,7 +17586,7 @@
         <w:rPr>
           <w:sz w:val="19"/>
         </w:rPr>
-        <w:t xml:space="preserve">[36] J. E. Beilharz, J. Maniam, and M. J. Morris,</w:t>
+        <w:t xml:space="preserve">[36] C. Prata et al.,</w:t>
       </w:r>
       <w:r>
         <w:rPr>
@@ -17630,7 +17604,7 @@
         <w:rPr>
           <w:sz w:val="19"/>
         </w:rPr>
-        <w:t xml:space="preserve">Short exposure to a diet rich in both fat and sugar or sugar alone impairs place, but not object recognition memory in rats,</w:t>
+        <w:t xml:space="preserve">Glycosides from Stevia rebaudiana Bertoni possess insulin-mimetic and antioxidant activities in rat cardiac fibroblasts,</w:t>
       </w:r>
       <w:r>
         <w:rPr>
@@ -17648,7 +17622,7 @@
         <w:rPr>
           <w:sz w:val="19"/>
         </w:rPr>
-        <w:t xml:space="preserve">Brain Behav. Immun., vol. 37, pp. 134–141, 2014. doi: 10.1016/j.bbi.2013.11.016</w:t>
+        <w:t xml:space="preserve">Oxid. Med. Cell. Longev., vol. 2017, Aug. 2017, Art. no. 3724545. doi: 10.1155/2017/3724545 [Online]. Available: https://www.ncbi.nlm.nih.gov/pmc/articles/PMC5602648/</w:t>
       </w:r>
     </w:p>
     <w:p>
@@ -17661,7 +17635,7 @@
         <w:rPr>
           <w:sz w:val="19"/>
         </w:rPr>
-        <w:t xml:space="preserve">[37] J. E. Beilharz, J. Maniam, and M. J. Morris,</w:t>
+        <w:t xml:space="preserve">[37] D. Sharma, M. Puri, A. K. Tiwary, N. Singh, and A. S. Jaggi,</w:t>
       </w:r>
       <w:r>
         <w:rPr>
@@ -17679,7 +17653,7 @@
         <w:rPr>
           <w:sz w:val="19"/>
         </w:rPr>
-        <w:t xml:space="preserve">Short-term exposure to a diet high in fat and sugar, or liquid sugar, selectively impairs hippocampal-dependent memory, with differential impacts on inflammation,</w:t>
+        <w:t xml:space="preserve">Antiamnesic effect of stevioside in scopolamine-treated rats,</w:t>
       </w:r>
       <w:r>
         <w:rPr>
@@ -17697,7 +17671,7 @@
         <w:rPr>
           <w:sz w:val="19"/>
         </w:rPr>
-        <w:t xml:space="preserve">Behav. Brain Res., vol. 306, pp. 1–7, 2016. doi: 10.1016/j.bbr.2016.03.018</w:t>
+        <w:t xml:space="preserve">Indian J. Pharmacol., vol. 42, no. 3, pp. 164–167, 2010. doi: 10.4103/0253-7613.66840</w:t>
       </w:r>
     </w:p>
     <w:p>
@@ -17710,7 +17684,7 @@
         <w:rPr>
           <w:sz w:val="19"/>
         </w:rPr>
-        <w:t xml:space="preserve">[38] G. Kempermann, H. Song, and F. H. Gage,</w:t>
+        <w:t xml:space="preserve">[38] V. A. Chavushyan et al.,</w:t>
       </w:r>
       <w:r>
         <w:rPr>
@@ -17728,7 +17702,7 @@
         <w:rPr>
           <w:sz w:val="19"/>
         </w:rPr>
-        <w:t xml:space="preserve">Neurogenesis in the adult hippocampus,</w:t>
+        <w:t xml:space="preserve">Effects of stevia on synaptic plasticity and NADPH oxidase level of CNS in conditions of metabolic disorders caused by fructose,</w:t>
       </w:r>
       <w:r>
         <w:rPr>
@@ -17746,7 +17720,7 @@
         <w:rPr>
           <w:sz w:val="19"/>
         </w:rPr>
-        <w:t xml:space="preserve">Cold Spring Harb. Perspect. Biol., vol. 7, no. 9, a018812, 2015. doi: 10.1101/cshperspect.a018812</w:t>
+        <w:t xml:space="preserve">BMC Complement. Altern. Med., vol. 17, Dec. 2017, Art. no. 540. doi: 10.1186/s12906-017-2049-9</w:t>
       </w:r>
     </w:p>
     <w:p>
@@ -17759,7 +17733,7 @@
         <w:rPr>
           <w:sz w:val="19"/>
         </w:rPr>
-        <w:t xml:space="preserve">[39] J. Maniam, C. P. Antoniadis, N. A. Youngson, J. K. Sinha, and M. J. Morris,</w:t>
+        <w:t xml:space="preserve">[39] J. E. Beilharz, J. Maniam, and M. J. Morris,</w:t>
       </w:r>
       <w:r>
         <w:rPr>
@@ -17777,7 +17751,7 @@
         <w:rPr>
           <w:sz w:val="19"/>
         </w:rPr>
-        <w:t xml:space="preserve">Sugar consumption produces effects similar to early life stress exposure on hippocampal markers of neurogenesis and stress response,</w:t>
+        <w:t xml:space="preserve">Short exposure to a diet rich in both fat and sugar or sugar alone impairs place, but not object recognition memory in rats,</w:t>
       </w:r>
       <w:r>
         <w:rPr>
@@ -17795,7 +17769,7 @@
         <w:rPr>
           <w:sz w:val="19"/>
         </w:rPr>
-        <w:t xml:space="preserve">Front. Mol. Neurosci., vol. 8, Jan. 2016, Art. no. 86. doi: 10.3389/fnmol.2015.00086 [Online]. Available: https://www.ncbi.nlm.nih.gov/pmc/articles/PMC4717325/</w:t>
+        <w:t xml:space="preserve">Brain Behav. Immun., vol. 37, pp. 134–141, 2014. doi: 10.1016/j.bbi.2013.11.016</w:t>
       </w:r>
     </w:p>
     <w:p>
@@ -17808,7 +17782,7 @@
         <w:rPr>
           <w:sz w:val="19"/>
         </w:rPr>
-        <w:t xml:space="preserve">[40] D. A. Lukovikov et al.,</w:t>
+        <w:t xml:space="preserve">[40] J. E. Beilharz, J. Maniam, and M. J. Morris,</w:t>
       </w:r>
       <w:r>
         <w:rPr>
@@ -17826,7 +17800,7 @@
         <w:rPr>
           <w:sz w:val="19"/>
         </w:rPr>
-        <w:t xml:space="preserve">Automated phenotyping of rodent behavior in the Cylinder Exploration Test using machine learning,</w:t>
+        <w:t xml:space="preserve">Short-term exposure to a diet high in fat and sugar, or liquid sugar, selectively impairs hippocampal-dependent memory, with differential impacts on inflammation,</w:t>
       </w:r>
       <w:r>
         <w:rPr>
@@ -17844,7 +17818,7 @@
         <w:rPr>
           <w:sz w:val="19"/>
         </w:rPr>
-        <w:t xml:space="preserve">Neuroscience, vol. 601, pp. 169–178, May 2026. doi: 10.1016/j.neuroscience.2026.02.048 [Online]. Available: https://pubmed.ncbi.nlm.nih.gov/41780714/</w:t>
+        <w:t xml:space="preserve">Behav. Brain Res., vol. 306, pp. 1–7, 2016. doi: 10.1016/j.bbr.2016.03.018</w:t>
       </w:r>
     </w:p>
     <w:p>
@@ -17857,7 +17831,154 @@
         <w:rPr>
           <w:sz w:val="19"/>
         </w:rPr>
-        <w:t xml:space="preserve">[41] A. Gerós, A. Magalhães, and P. Aguiar,</w:t>
+        <w:t xml:space="preserve">[41] G. Kempermann, H. Song, and F. H. Gage,</w:t>
+      </w:r>
+      <w:r>
+        <w:rPr>
+          <w:sz w:val="19"/>
+        </w:rPr>
+        <w:t xml:space="preserve"> </w:t>
+      </w:r>
+      <w:r>
+        <w:rPr>
+          <w:sz w:val="19"/>
+        </w:rPr>
+        <w:t xml:space="preserve">“</w:t>
+      </w:r>
+      <w:r>
+        <w:rPr>
+          <w:sz w:val="19"/>
+        </w:rPr>
+        <w:t xml:space="preserve">Neurogenesis in the adult hippocampus,</w:t>
+      </w:r>
+      <w:r>
+        <w:rPr>
+          <w:sz w:val="19"/>
+        </w:rPr>
+        <w:t xml:space="preserve">”</w:t>
+      </w:r>
+      <w:r>
+        <w:rPr>
+          <w:sz w:val="19"/>
+        </w:rPr>
+        <w:t xml:space="preserve"> </w:t>
+      </w:r>
+      <w:r>
+        <w:rPr>
+          <w:sz w:val="19"/>
+        </w:rPr>
+        <w:t xml:space="preserve">Cold Spring Harb. Perspect. Biol., vol. 7, no. 9, a018812, 2015. doi: 10.1101/cshperspect.a018812</w:t>
+      </w:r>
+    </w:p>
+    <w:p>
+      <w:pPr>
+        <w:pStyle w:val="BodyText"/>
+        <w:spacing w:after="80"/>
+        <w:jc w:val="left"/>
+      </w:pPr>
+      <w:r>
+        <w:rPr>
+          <w:sz w:val="19"/>
+        </w:rPr>
+        <w:t xml:space="preserve">[42] J. Maniam, C. P. Antoniadis, N. A. Youngson, J. K. Sinha, and M. J. Morris,</w:t>
+      </w:r>
+      <w:r>
+        <w:rPr>
+          <w:sz w:val="19"/>
+        </w:rPr>
+        <w:t xml:space="preserve"> </w:t>
+      </w:r>
+      <w:r>
+        <w:rPr>
+          <w:sz w:val="19"/>
+        </w:rPr>
+        <w:t xml:space="preserve">“</w:t>
+      </w:r>
+      <w:r>
+        <w:rPr>
+          <w:sz w:val="19"/>
+        </w:rPr>
+        <w:t xml:space="preserve">Sugar consumption produces effects similar to early life stress exposure on hippocampal markers of neurogenesis and stress response,</w:t>
+      </w:r>
+      <w:r>
+        <w:rPr>
+          <w:sz w:val="19"/>
+        </w:rPr>
+        <w:t xml:space="preserve">”</w:t>
+      </w:r>
+      <w:r>
+        <w:rPr>
+          <w:sz w:val="19"/>
+        </w:rPr>
+        <w:t xml:space="preserve"> </w:t>
+      </w:r>
+      <w:r>
+        <w:rPr>
+          <w:sz w:val="19"/>
+        </w:rPr>
+        <w:t xml:space="preserve">Front. Mol. Neurosci., vol. 8, Jan. 2016, Art. no. 86. doi: 10.3389/fnmol.2015.00086 [Online]. Available: https://www.ncbi.nlm.nih.gov/pmc/articles/PMC4717325/</w:t>
+      </w:r>
+    </w:p>
+    <w:p>
+      <w:pPr>
+        <w:pStyle w:val="BodyText"/>
+        <w:spacing w:after="80"/>
+        <w:jc w:val="left"/>
+      </w:pPr>
+      <w:r>
+        <w:rPr>
+          <w:sz w:val="19"/>
+        </w:rPr>
+        <w:t xml:space="preserve">[43] D. A. Lukovikov et al.,</w:t>
+      </w:r>
+      <w:r>
+        <w:rPr>
+          <w:sz w:val="19"/>
+        </w:rPr>
+        <w:t xml:space="preserve"> </w:t>
+      </w:r>
+      <w:r>
+        <w:rPr>
+          <w:sz w:val="19"/>
+        </w:rPr>
+        <w:t xml:space="preserve">“</w:t>
+      </w:r>
+      <w:r>
+        <w:rPr>
+          <w:sz w:val="19"/>
+        </w:rPr>
+        <w:t xml:space="preserve">Automated phenotyping of rodent behavior in the Cylinder Exploration Test using machine learning,</w:t>
+      </w:r>
+      <w:r>
+        <w:rPr>
+          <w:sz w:val="19"/>
+        </w:rPr>
+        <w:t xml:space="preserve">”</w:t>
+      </w:r>
+      <w:r>
+        <w:rPr>
+          <w:sz w:val="19"/>
+        </w:rPr>
+        <w:t xml:space="preserve"> </w:t>
+      </w:r>
+      <w:r>
+        <w:rPr>
+          <w:sz w:val="19"/>
+        </w:rPr>
+        <w:t xml:space="preserve">Neuroscience, vol. 601, pp. 169–178, May 2026. doi: 10.1016/j.neuroscience.2026.02.048 [Online]. Available: https://pubmed.ncbi.nlm.nih.gov/41780714/</w:t>
+      </w:r>
+    </w:p>
+    <w:p>
+      <w:pPr>
+        <w:pStyle w:val="BodyText"/>
+        <w:spacing w:after="80"/>
+        <w:jc w:val="left"/>
+      </w:pPr>
+      <w:r>
+        <w:rPr>
+          <w:sz w:val="19"/>
+        </w:rPr>
+        <w:t xml:space="preserve">[44] A. Gerós, A. Magalhães, and P. Aguiar,</w:t>
       </w:r>
       <w:r>
         <w:rPr>

</xml_diff>

<commit_message>
Word 20261021 con las dudas para Sol marcadas (resaltado y comentarios, paginas 29-31)
Co-Authored-By: Claude Opus 5.5 <noreply@anthropic.com>
</commit_message>
<xml_diff>
--- a/entregas/metodos resultados discusion 20261021.docx
+++ b/entregas/metodos resultados discusion 20261021.docx
@@ -15449,7 +15449,21 @@
         <w:pStyle w:val="FirstParagraph"/>
       </w:pPr>
       <w:r>
-        <w:t xml:space="preserve">Durante el tratamiento, los animales juveniles consumieron, en relación con su peso corporal, más del doble de solución endulzada que los adultos, tanto de sacarosa como de stevia (§5.1.1). Sin embargo, el índice de preferencia no presentó diferencias significativas entre edades, lo que indica que esta mayor ingesta relativa no estuvo acompañada de una mayor preferencia por el sabor dulce. En consecuencia, a pesar de presentar una preferencia comparable por las soluciones endulzadas, los animales juveniles consumieron cantidades considerablemente superiores de sacarosa y de stevia por unidad de peso corporal que los adultos. Asimismo, la ingesta de stevia superó la ingesta diaria admisible de glucósidos de esteviol, de 4 mg/kg de peso corporal por día expresada como equivalentes de esteviol [19], y este exceso fue más pronunciado durante la etapa juvenil. Según la composición del extracto (Tabla 4.1, con los factores de conversión a esteviol de 0,40 para el esteviósido y de 0,33 para los rebaudiósidos A y C [19]), la bebida al 4 % contenía alrededor de 0,08 mg/mL de equivalentes de esteviol; con un consumo medio de 0,24 y 0,09 mL/g de peso corporal por día, los animales juveniles ingirieron alrededor de 20 mg/kg/día (unas cinco veces la ingesta diaria admisible) y los adultos, alrededor de 7 mg/kg/día (1,8 veces).</w:t>
+        <w:t xml:space="preserve">Durante el tratamiento, los animales juveniles consumieron, en relación con su peso corporal, más del doble de solución endulzada que los adultos, tanto de sacarosa como de stevia (§5.1.1). Sin embargo, el índice de preferencia no presentó diferencias significativas entre edades, lo que indica que esta mayor ingesta relativa no estuvo acompañada de una mayor preferencia por el sabor dulce. En consecuencia, a pesar de presentar una preferencia comparable por las soluciones endulzadas, los animales juveniles consumieron cantidades considerablemente superiores de sacarosa y de stevia por unidad de peso corporal que los adultos. </w:t>
+      </w:r>
+      <w:commentRangeStart w:id="0"/>
+      <w:r>
+        <w:rPr>
+          <w:highlight w:val="yellow"/>
+        </w:rPr>
+        <w:t>Asimismo, la ingesta de stevia superó la ingesta diaria admisible de glucósidos de esteviol, de 4 mg/kg de peso corporal por día expresada como equivalentes de esteviol [19], y este exceso fue más pronunciado durante la etapa juvenil. Según la composición del extracto (Tabla 4.1, con los factores de conversión a esteviol de 0,40 para el esteviósido y de 0,33 para los rebaudiósidos A y C [19]), la bebida al 4 % contenía alrededor de 0,08 mg/mL de equivalentes de esteviol; con un consumo medio de 0,24 y 0,09 mL/g de peso corporal por día, los animales juveniles ingirieron alrededor de 20 mg/kg/día (unas cinco veces la ingesta diaria admisible) y los adultos, alrededor de 7 mg/kg/día (1,8 veces).</w:t>
+      </w:r>
+      <w:commentRangeEnd w:id="0"/>
+      <w:r>
+        <w:rPr>
+          <w:rStyle w:val="CommentReference"/>
+        </w:rPr>
+        <w:commentReference w:id="0"/>
       </w:r>
     </w:p>
     <w:p>
@@ -15534,18 +15548,41 @@
       <w:pPr>
         <w:pStyle w:val="BodyText"/>
       </w:pPr>
-      <w:r>
-        <w:t xml:space="preserve">Estudios previos del laboratorio mostraron que el consumo temprano de stevia no produce cambios en la conducta tipo ansiosa de ratas macho juveniles cuando se evalúa a corto plazo, al finalizar la exposición [22, 23]</w:t>
-      </w:r>
-      <w:r>
-        <w:t xml:space="preserve"> </w:t>
-      </w:r>
+      <w:commentRangeStart w:id="1"/>
+      <w:r>
+        <w:rPr>
+          <w:highlight w:val="yellow"/>
+        </w:rPr>
+        <w:t>Estudios previos del laboratorio mostraron que el consumo temprano de stevia no produce cambios en la conducta tipo ansiosa de ratas macho juveniles cuando se evalúa a corto plazo, al finalizar la exposición</w:t>
+      </w:r>
+      <w:commentRangeEnd w:id="1"/>
+      <w:r>
+        <w:rPr>
+          <w:rStyle w:val="CommentReference"/>
+        </w:rPr>
+        <w:commentReference w:id="1"/>
+      </w:r>
+      <w:r>
+        <w:t xml:space="preserve"> [22, 23]</w:t>
+      </w:r>
+      <w:r>
+        <w:t xml:space="preserve"> </w:t>
+      </w:r>
+      <w:commentRangeStart w:id="2"/>
       <w:r>
         <w:rPr>
           <w:bCs/>
           <w:b/>
+          <w:highlight w:val="yellow"/>
         </w:rPr>
         <w:t xml:space="preserve">[CONFIRMAR: coautores y revista del manuscrito de Marchena et al.]</w:t>
+      </w:r>
+      <w:commentRangeEnd w:id="2"/>
+      <w:r>
+        <w:rPr>
+          <w:rStyle w:val="CommentReference"/>
+        </w:rPr>
+        <w:commentReference w:id="2"/>
       </w:r>
       <w:r>
         <w:t xml:space="preserve">. Esto sugiere que la abstinencia de la bebida endulzada con stevia, algunas alteraciones neurobiológicas, o ambas, serían responsables de los cambios a largo plazo en la conducta de tipo ansioso. Lo mismo ocurre con la sacarosa, cuyos efectos sobre la conducta tipo ansiosa evaluados a corto plazo [6, 24] difieren de los descriptos a largo plazo [1]. De manera similar, en ratas macho con acceso a stevia durante la adolescencia y evaluadas al finalizar el consumo, la stevia aumentó la locomoción en el</w:t>
@@ -15635,7 +15672,24 @@
         <w:t xml:space="preserve">open field</w:t>
       </w:r>
       <w:r>
-        <w:t xml:space="preserve">, estudios previos del laboratorio indican que el consumo agudo de stevia durante la etapa juvenil no produce alteraciones en la memoria de localización de objetos (prueba NOL), una memoria dependiente del hipocampo [22, 23]. Además, estos animales presentaron modificaciones en la expresión de calretinina (CR), un marcador de determinadas poblaciones de interneuronas GABAérgicas, en la corteza prefrontal medial [23]. Las interneuronas que expresan parvalbúmina (PV) y CR son importantes reguladoras de la actividad de los circuitos neuronales y desempeñan funciones relevantes en procesos cognitivos como la memoria y la sincronización de las redes neuronales [27, 28]. En este sentido, estudios previos demostraron que la disminución de la expresión de PV en el hipocampo y en la corteza prefrontal tras el consumo de sacarosa se asocia con alteraciones de la memoria y de las conductas de tipo ansioso [1, 29–31]. Considerando estos antecedentes, sería de interés investigar si las modificaciones en la expresión de CR tras el consumo juvenil de stevia persisten hasta la edad adulta y si se relacionan con las alteraciones de la memoria de reconocimiento observadas a largo plazo.</w:t>
+        <w:t xml:space="preserve">, estudios previos del laboratorio indican que el consumo agudo de stevia durante la etapa juvenil </w:t>
+      </w:r>
+      <w:commentRangeStart w:id="3"/>
+      <w:r>
+        <w:rPr>
+          <w:highlight w:val="yellow"/>
+        </w:rPr>
+        <w:t>no produce alteraciones en la memoria de localización de objetos (prueba NOL), una memoria dependiente del hipocampo</w:t>
+      </w:r>
+      <w:commentRangeEnd w:id="3"/>
+      <w:r>
+        <w:rPr>
+          <w:rStyle w:val="CommentReference"/>
+        </w:rPr>
+        <w:commentReference w:id="3"/>
+      </w:r>
+      <w:r>
+        <w:t xml:space="preserve"> [22, 23]. Además, estos animales presentaron modificaciones en la expresión de calretinina (CR), un marcador de determinadas poblaciones de interneuronas GABAérgicas, en la corteza prefrontal medial [23]. Las interneuronas que expresan parvalbúmina (PV) y CR son importantes reguladoras de la actividad de los circuitos neuronales y desempeñan funciones relevantes en procesos cognitivos como la memoria y la sincronización de las redes neuronales [27, 28]. En este sentido, estudios previos demostraron que la disminución de la expresión de PV en el hipocampo y en la corteza prefrontal tras el consumo de sacarosa se asocia con alteraciones de la memoria y de las conductas de tipo ansioso [1, 29–31]. Considerando estos antecedentes, sería de interés investigar si las modificaciones en la expresión de CR tras el consumo juvenil de stevia persisten hasta la edad adulta y si se relacionan con las alteraciones de la memoria de reconocimiento observadas a largo plazo.</w:t>
       </w:r>
     </w:p>
     <w:p>
@@ -18027,7 +18081,72 @@
 </file>
 
 <file path=word/comments.xml><?xml version="1.0" encoding="utf-8"?>
-<w:comments xmlns:w="http://schemas.openxmlformats.org/wordprocessingml/2006/main" xmlns:m="http://schemas.openxmlformats.org/officeDocument/2006/math" xmlns:r="http://schemas.openxmlformats.org/officeDocument/2006/relationships" xmlns:o="urn:schemas-microsoft-com:office:office" xmlns:v="urn:schemas-microsoft-com:vml" xmlns:w10="urn:schemas-microsoft-com:office:word" xmlns:a="http://schemas.openxmlformats.org/drawingml/2006/main" xmlns:pic="http://schemas.openxmlformats.org/drawingml/2006/picture" xmlns:wp="http://schemas.openxmlformats.org/drawingml/2006/wordprocessingDrawing"/>
+<w:comments xmlns:w="http://schemas.openxmlformats.org/wordprocessingml/2006/main" xmlns:m="http://schemas.openxmlformats.org/officeDocument/2006/math" xmlns:r="http://schemas.openxmlformats.org/officeDocument/2006/relationships" xmlns:o="urn:schemas-microsoft-com:office:office" xmlns:v="urn:schemas-microsoft-com:vml" xmlns:w10="urn:schemas-microsoft-com:office:word" xmlns:a="http://schemas.openxmlformats.org/drawingml/2006/main" xmlns:pic="http://schemas.openxmlformats.org/drawingml/2006/picture" xmlns:wp="http://schemas.openxmlformats.org/drawingml/2006/wordprocessingDrawing">
+  <w:comment w:id="0" w:author="Thiago Sayegh" w:initials="TS" w:date="2026-10-21T13:29:10Z">
+    <w:p>
+      <w:pPr>
+        <w:pStyle w:val="CommentText"/>
+      </w:pPr>
+      <w:r>
+        <w:rPr>
+          <w:rStyle w:val="CommentReference"/>
+        </w:rPr>
+        <w:annotationRef/>
+      </w:r>
+      <w:r>
+        <w:t>Pregunta 1. Lo de los valores diarios lo pude calcular solo para la stevia (IDA de EFSA, 4 mg/kg/día en equivalentes de esteviol): juveniles unas 5 veces la IDA y adultos 1,8 veces. Para la sacarosa haría falta el consumo de alimento de los adultos, así que lo saqué. Lo dejamos solo para la stevia?</w:t>
+      </w:r>
+    </w:p>
+  </w:comment>
+  <w:comment w:id="1" w:author="Thiago Sayegh" w:initials="TS" w:date="2026-10-21T13:29:10Z">
+    <w:p>
+      <w:pPr>
+        <w:pStyle w:val="CommentText"/>
+      </w:pPr>
+      <w:r>
+        <w:rPr>
+          <w:rStyle w:val="CommentReference"/>
+        </w:rPr>
+        <w:annotationRef/>
+      </w:r>
+      <w:r>
+        <w:t>Pregunta 2. Como presentación a congreso cité el resumen de la Reunión Conjunta SAIC-SAB 2023 (Coirini et al., Medicina 83, Supl. V, p. 148). Ahí dice stevia al 0,5 % y el manuscrito de Marchena dice 4 %. Es el mismo experimento? Si no, cuál cito?</w:t>
+      </w:r>
+    </w:p>
+  </w:comment>
+  <w:comment w:id="2" w:author="Thiago Sayegh" w:initials="TS" w:date="2026-10-21T13:29:10Z">
+    <w:p>
+      <w:pPr>
+        <w:pStyle w:val="CommentText"/>
+      </w:pPr>
+      <w:r>
+        <w:rPr>
+          <w:rStyle w:val="CommentReference"/>
+        </w:rPr>
+        <w:annotationRef/>
+      </w:r>
+      <w:r>
+        <w:t>Pregunta 3. Cité el manuscrito como "A. Marchena et al., manuscrito enviado para publicación". Me pasás los coautores y la revista?</w:t>
+      </w:r>
+    </w:p>
+  </w:comment>
+  <w:comment w:id="3" w:author="Thiago Sayegh" w:initials="TS" w:date="2026-10-21T13:29:10Z">
+    <w:p>
+      <w:pPr>
+        <w:pStyle w:val="CommentText"/>
+      </w:pPr>
+      <w:r>
+        <w:rPr>
+          <w:rStyle w:val="CommentReference"/>
+        </w:rPr>
+        <w:annotationRef/>
+      </w:r>
+      <w:r>
+        <w:t>Pregunta 4. En el estudio agudo la memoria se evaluó con NOL, así que cambié "memoria de reconocimiento a corto plazo" por "memoria de localización de objetos". Está bien?</w:t>
+      </w:r>
+    </w:p>
+  </w:comment>
+</w:comments>
 </file>
 
 <file path=word/footnotes.xml><?xml version="1.0" encoding="utf-8"?>

</xml_diff>

<commit_message>
Discusion: referencia del manuscrito de Marchena (J Nutr, en revision) y comparacion de la sacarosa con el valor de la OMS, segun Sol
Co-Authored-By: Claude Opus 5.5 <noreply@anthropic.com>
</commit_message>
<xml_diff>
--- a/entregas/metodos resultados discusion 20261021.docx
+++ b/entregas/metodos resultados discusion 20261021.docx
@@ -15449,21 +15449,7 @@
         <w:pStyle w:val="FirstParagraph"/>
       </w:pPr>
       <w:r>
-        <w:t xml:space="preserve">Durante el tratamiento, los animales juveniles consumieron, en relación con su peso corporal, más del doble de solución endulzada que los adultos, tanto de sacarosa como de stevia (§5.1.1). Sin embargo, el índice de preferencia no presentó diferencias significativas entre edades, lo que indica que esta mayor ingesta relativa no estuvo acompañada de una mayor preferencia por el sabor dulce. En consecuencia, a pesar de presentar una preferencia comparable por las soluciones endulzadas, los animales juveniles consumieron cantidades considerablemente superiores de sacarosa y de stevia por unidad de peso corporal que los adultos. </w:t>
-      </w:r>
-      <w:commentRangeStart w:id="0"/>
-      <w:r>
-        <w:rPr>
-          <w:highlight w:val="yellow"/>
-        </w:rPr>
-        <w:t>Asimismo, la ingesta de stevia superó la ingesta diaria admisible de glucósidos de esteviol, de 4 mg/kg de peso corporal por día expresada como equivalentes de esteviol [19], y este exceso fue más pronunciado durante la etapa juvenil. Según la composición del extracto (Tabla 4.1, con los factores de conversión a esteviol de 0,40 para el esteviósido y de 0,33 para los rebaudiósidos A y C [19]), la bebida al 4 % contenía alrededor de 0,08 mg/mL de equivalentes de esteviol; con un consumo medio de 0,24 y 0,09 mL/g de peso corporal por día, los animales juveniles ingirieron alrededor de 20 mg/kg/día (unas cinco veces la ingesta diaria admisible) y los adultos, alrededor de 7 mg/kg/día (1,8 veces).</w:t>
-      </w:r>
-      <w:commentRangeEnd w:id="0"/>
-      <w:r>
-        <w:rPr>
-          <w:rStyle w:val="CommentReference"/>
-        </w:rPr>
-        <w:commentReference w:id="0"/>
+        <w:t xml:space="preserve">Durante el tratamiento, los animales juveniles consumieron, en relación con su peso corporal, más del doble de solución endulzada que los adultos, tanto de sacarosa como de stevia (§5.1.1). Sin embargo, el índice de preferencia no presentó diferencias significativas entre edades, lo que indica que esta mayor ingesta relativa no estuvo acompañada de una mayor preferencia por el sabor dulce. En consecuencia, a pesar de presentar una preferencia comparable por las soluciones endulzadas, los animales juveniles consumieron cantidades considerablemente superiores de sacarosa y de stevia por unidad de peso corporal que los adultos. Asimismo, la ingesta de ambos edulcorantes superó los valores diarios de referencia correspondientes, y este exceso fue más pronunciado durante la etapa juvenil. La OMS recomienda que los azúcares libres aporten menos del 10 % de la ingesta energética total [19], lo que para una ingesta de 2000 kcal equivale a unos 50 g por día, es decir, alrededor de 0,7 g/kg de peso corporal para un adulto de 70 kg. Con un consumo medio de 0,54 y 0,23 mL/g de peso corporal por día de la solución al 10 %, los animales expuestos a sacarosa ingirieron alrededor de 54 g/kg/día (juveniles) y 23 g/kg/día (adultos), unas 75 y 32 veces ese valor, respectivamente. De manera similar, la ingesta de stevia superó la ingesta diaria admisible de glucósidos de esteviol, de 4 mg/kg de peso corporal por día expresada como equivalentes de esteviol [20]. Según la composición del extracto (Tabla 4.1, con los factores de conversión a esteviol de 0,40 para el esteviósido y de 0,33 para los rebaudiósidos A y C [20]), la bebida al 4 % contenía alrededor de 0,08 mg/mL de equivalentes de esteviol; con un consumo medio de 0,24 y 0,09 mL/g de peso corporal por día, los animales juveniles ingirieron alrededor de 20 mg/kg/día (unas cinco veces la ingesta diaria admisible) y los adultos, alrededor de 7 mg/kg/día (1,8 veces).</w:t>
       </w:r>
     </w:p>
     <w:p>
@@ -15471,7 +15457,7 @@
         <w:pStyle w:val="BodyText"/>
       </w:pPr>
       <w:r>
-        <w:t xml:space="preserve">Los animales prefirieron la sacarosa más que la stevia en ambas edades. Este resultado es compatible con la propuesta de que el sabor dulce disociado del aporte calórico se procesa de forma distinta en los circuitos de recompensa [20], y con el hallazgo de que el consumo de stevia aumenta la expresión de ΔFosB, un marcador de activación sostenida, en el núcleo accumbens, el caudado-putamen y la corteza prefrontal, regiones del sistema de recompensa; en ese trabajo, la cría en un ambiente enriquecido redujo tanto el consumo de stevia como ese aumento de ΔFosB [21]. Una menor preferencia por la solución no calórica puede considerarse un aspecto favorable de la stevia, ya que sugiere un menor potencial para promover un consumo excesivo; de hecho, los animales consumieron menos stevia que sacarosa en ambas ventanas de edad (§5.1.1).</w:t>
+        <w:t xml:space="preserve">Los animales prefirieron la sacarosa más que la stevia en ambas edades. Este resultado es compatible con la propuesta de que el sabor dulce disociado del aporte calórico se procesa de forma distinta en los circuitos de recompensa [21], y con el hallazgo de que el consumo de stevia aumenta la expresión de ΔFosB, un marcador de activación sostenida, en el núcleo accumbens, el caudado-putamen y la corteza prefrontal, regiones del sistema de recompensa; en ese trabajo, la cría en un ambiente enriquecido redujo tanto el consumo de stevia como ese aumento de ΔFosB [22]. Una menor preferencia por la solución no calórica puede considerarse un aspecto favorable de la stevia, ya que sugiere un menor potencial para promover un consumo excesivo; de hecho, los animales consumieron menos stevia que sacarosa en ambas ventanas de edad (§5.1.1).</w:t>
       </w:r>
     </w:p>
     <w:p>
@@ -15548,44 +15534,8 @@
       <w:pPr>
         <w:pStyle w:val="BodyText"/>
       </w:pPr>
-      <w:commentRangeStart w:id="1"/>
-      <w:r>
-        <w:rPr>
-          <w:highlight w:val="yellow"/>
-        </w:rPr>
-        <w:t>Estudios previos del laboratorio mostraron que el consumo temprano de stevia no produce cambios en la conducta tipo ansiosa de ratas macho juveniles cuando se evalúa a corto plazo, al finalizar la exposición</w:t>
-      </w:r>
-      <w:commentRangeEnd w:id="1"/>
-      <w:r>
-        <w:rPr>
-          <w:rStyle w:val="CommentReference"/>
-        </w:rPr>
-        <w:commentReference w:id="1"/>
-      </w:r>
-      <w:r>
-        <w:t xml:space="preserve"> [22, 23]</w:t>
-      </w:r>
-      <w:r>
-        <w:t xml:space="preserve"> </w:t>
-      </w:r>
-      <w:commentRangeStart w:id="2"/>
-      <w:r>
-        <w:rPr>
-          <w:bCs/>
-          <w:b/>
-          <w:highlight w:val="yellow"/>
-        </w:rPr>
-        <w:t xml:space="preserve">[CONFIRMAR: coautores y revista del manuscrito de Marchena et al.]</w:t>
-      </w:r>
-      <w:commentRangeEnd w:id="2"/>
-      <w:r>
-        <w:rPr>
-          <w:rStyle w:val="CommentReference"/>
-        </w:rPr>
-        <w:commentReference w:id="2"/>
-      </w:r>
-      <w:r>
-        <w:t xml:space="preserve">. Esto sugiere que la abstinencia de la bebida endulzada con stevia, algunas alteraciones neurobiológicas, o ambas, serían responsables de los cambios a largo plazo en la conducta de tipo ansioso. Lo mismo ocurre con la sacarosa, cuyos efectos sobre la conducta tipo ansiosa evaluados a corto plazo [6, 24] difieren de los descriptos a largo plazo [1]. De manera similar, en ratas macho con acceso a stevia durante la adolescencia y evaluadas al finalizar el consumo, la stevia aumentó la locomoción en el</w:t>
+      <w:r>
+        <w:t xml:space="preserve">Estudios previos del laboratorio mostraron que el consumo temprano de stevia no produce cambios en la conducta tipo ansiosa de ratas macho juveniles cuando se evalúa a corto plazo, al finalizar la exposición [23, 24]. Esto sugiere que la abstinencia de la bebida endulzada con stevia, algunas alteraciones neurobiológicas, o ambas, serían responsables de los cambios a largo plazo en la conducta de tipo ansioso. Lo mismo ocurre con la sacarosa, cuyos efectos sobre la conducta tipo ansiosa evaluados a corto plazo [6, 25] difieren de los descriptos a largo plazo [1]. De manera similar, en ratas macho con acceso a stevia durante la adolescencia y evaluadas al finalizar el consumo, la stevia aumentó la locomoción en el</w:t>
       </w:r>
       <w:r>
         <w:t xml:space="preserve"> </w:t>
@@ -15601,7 +15551,7 @@
         <w:t xml:space="preserve"> </w:t>
       </w:r>
       <w:r>
-        <w:t xml:space="preserve">[25], mientras que en este trabajo, a largo plazo, no modificó la distancia total recorrida y aumentó la exploración de las zonas centrales. Por otra parte, resultados previos del laboratorio demostraron que la exposición temprana al mismo extracto acuoso en ratas hembra juveniles disminuye las conductas de tipo ansioso en el laberinto en cruz elevado [3]. Estos hallazgos sugieren la existencia de diferencias sexuales en la respuesta conductual al extracto. En este contexto, sería de interés investigar si los efectos ansiolíticos observados en las hembras persisten a largo plazo y si la edad de exposición influye en su magnitud y persistencia.</w:t>
+        <w:t xml:space="preserve">[26], mientras que en este trabajo, a largo plazo, no modificó la distancia total recorrida y aumentó la exploración de las zonas centrales. Por otra parte, resultados previos del laboratorio demostraron que la exposición temprana al mismo extracto acuoso en ratas hembra juveniles disminuye las conductas de tipo ansioso en el laberinto en cruz elevado [3]. Estos hallazgos sugieren la existencia de diferencias sexuales en la respuesta conductual al extracto. En este contexto, sería de interés investigar si los efectos ansiolíticos observados en las hembras persisten a largo plazo y si la edad de exposición influye en su magnitud y persistencia.</w:t>
       </w:r>
     </w:p>
     <w:p>
@@ -15609,7 +15559,7 @@
         <w:pStyle w:val="BodyText"/>
       </w:pPr>
       <w:r>
-        <w:t xml:space="preserve">Estos resultados están en línea con los que demuestran efectos ansiolíticos de la stevia en ratas diabéticas [26]. Los animales expuestos a stevia realizaron, además, menos</w:t>
+        <w:t xml:space="preserve">Estos resultados están en línea con los que demuestran efectos ansiolíticos de la stevia en ratas diabéticas [27]. Los animales expuestos a stevia realizaron, además, menos</w:t>
       </w:r>
       <w:r>
         <w:t xml:space="preserve"> </w:t>
@@ -15672,24 +15622,7 @@
         <w:t xml:space="preserve">open field</w:t>
       </w:r>
       <w:r>
-        <w:t xml:space="preserve">, estudios previos del laboratorio indican que el consumo agudo de stevia durante la etapa juvenil </w:t>
-      </w:r>
-      <w:commentRangeStart w:id="3"/>
-      <w:r>
-        <w:rPr>
-          <w:highlight w:val="yellow"/>
-        </w:rPr>
-        <w:t>no produce alteraciones en la memoria de localización de objetos (prueba NOL), una memoria dependiente del hipocampo</w:t>
-      </w:r>
-      <w:commentRangeEnd w:id="3"/>
-      <w:r>
-        <w:rPr>
-          <w:rStyle w:val="CommentReference"/>
-        </w:rPr>
-        <w:commentReference w:id="3"/>
-      </w:r>
-      <w:r>
-        <w:t xml:space="preserve"> [22, 23]. Además, estos animales presentaron modificaciones en la expresión de calretinina (CR), un marcador de determinadas poblaciones de interneuronas GABAérgicas, en la corteza prefrontal medial [23]. Las interneuronas que expresan parvalbúmina (PV) y CR son importantes reguladoras de la actividad de los circuitos neuronales y desempeñan funciones relevantes en procesos cognitivos como la memoria y la sincronización de las redes neuronales [27, 28]. En este sentido, estudios previos demostraron que la disminución de la expresión de PV en el hipocampo y en la corteza prefrontal tras el consumo de sacarosa se asocia con alteraciones de la memoria y de las conductas de tipo ansioso [1, 29–31]. Considerando estos antecedentes, sería de interés investigar si las modificaciones en la expresión de CR tras el consumo juvenil de stevia persisten hasta la edad adulta y si se relacionan con las alteraciones de la memoria de reconocimiento observadas a largo plazo.</w:t>
+        <w:t xml:space="preserve">, estudios previos del laboratorio indican que el consumo agudo de stevia durante la etapa juvenil no produce alteraciones en la memoria de localización de objetos (prueba NOL), una memoria dependiente del hipocampo [23, 24]. Además, estos animales presentaron modificaciones en la expresión de calretinina (CR), un marcador de determinadas poblaciones de interneuronas GABAérgicas, en la corteza prefrontal medial [24]. Las interneuronas que expresan parvalbúmina (PV) y CR son importantes reguladoras de la actividad de los circuitos neuronales y desempeñan funciones relevantes en procesos cognitivos como la memoria y la sincronización de las redes neuronales [28, 29]. En este sentido, estudios previos demostraron que la disminución de la expresión de PV en el hipocampo y en la corteza prefrontal tras el consumo de sacarosa se asocia con alteraciones de la memoria y de las conductas de tipo ansioso [1, 30–32]. Considerando estos antecedentes, sería de interés investigar si las modificaciones en la expresión de CR tras el consumo juvenil de stevia persisten hasta la edad adulta y si se relacionan con las alteraciones de la memoria de reconocimiento observadas a largo plazo.</w:t>
       </w:r>
     </w:p>
     <w:p>
@@ -15697,7 +15630,7 @@
         <w:pStyle w:val="BodyText"/>
       </w:pPr>
       <w:r>
-        <w:t xml:space="preserve">Son escasos los trabajos que evaluaron los efectos de la stevia sobre la memoria a largo plazo, es decir, después de finalizado el consumo. La mayoría la evaluó mientras los animales aún consumían el edulcorante, con resultados dispares. Morales-Ríos et al. encontraron que el consumo de stevia durante 18 semanas alteró la memoria a largo plazo en el NOR de ratas macho adultas [32]. En cambio, Tsan et al., que administraron edulcorantes de bajas calorías (acesulfamo de potasio, sacarina o stevia) desde la etapa juvenil y evaluaron la memoria dependiente del hipocampo durante el período de consumo, describieron un deterioro al analizar los tres edulcorantes en conjunto, pero no al analizar la stevia por separado [33]. A largo plazo, solo se describió que el consumo materno de stevia durante la gestación y la lactancia se asocia con un peor desempeño de memoria en la descendencia macho adulta [34]. Este trabajo aporta, por lo tanto, evidencia de que el consumo de stevia en la etapa juvenil o en la adultez produce alteraciones de la memoria de reconocimiento que persisten después de finalizado el consumo, aunque más limitadas que las de la sacarosa.</w:t>
+        <w:t xml:space="preserve">Son escasos los trabajos que evaluaron los efectos de la stevia sobre la memoria a largo plazo, es decir, después de finalizado el consumo. La mayoría la evaluó mientras los animales aún consumían el edulcorante, con resultados dispares. Morales-Ríos et al. encontraron que el consumo de stevia durante 18 semanas alteró la memoria a largo plazo en el NOR de ratas macho adultas [33]. En cambio, Tsan et al., que administraron edulcorantes de bajas calorías (acesulfamo de potasio, sacarina o stevia) desde la etapa juvenil y evaluaron la memoria dependiente del hipocampo durante el período de consumo, describieron un deterioro al analizar los tres edulcorantes en conjunto, pero no al analizar la stevia por separado [34]. A largo plazo, solo se describió que el consumo materno de stevia durante la gestación y la lactancia se asocia con un peor desempeño de memoria en la descendencia macho adulta [35]. Este trabajo aporta, por lo tanto, evidencia de que el consumo de stevia en la etapa juvenil o en la adultez produce alteraciones de la memoria de reconocimiento que persisten después de finalizado el consumo, aunque más limitadas que las de la sacarosa.</w:t>
       </w:r>
     </w:p>
     <w:p>
@@ -15705,7 +15638,7 @@
         <w:pStyle w:val="BodyText"/>
       </w:pPr>
       <w:r>
-        <w:t xml:space="preserve">A diferencia de esos estudios, que administraron la stevia en dosis cercanas a la ingesta diaria admisible, aquí se administró un extracto acuoso de hojas que contiene, además de glucósidos de esteviol, compuestos fenólicos y flavonoides con actividad antioxidante (Tabla 4.1). La stevia redujo los marcadores de estrés oxidativo cerebral en ratas alimentadas con una dieta alta en grasas y sacarosa [35], y los glucósidos de esteviol presentan actividad antioxidante [36], revirtieron el deterioro de la memoria inducido por escopolamina [37] y modularon la plasticidad sináptica hipocampal en un modelo de desorden metabólico [38]. Estas propiedades podrían contribuir a que la stevia no produjera un deterioro sostenido de la memoria de reconocimiento.</w:t>
+        <w:t xml:space="preserve">A diferencia de esos estudios, que administraron la stevia en dosis cercanas a la ingesta diaria admisible, aquí se administró un extracto acuoso de hojas que contiene, además de glucósidos de esteviol, compuestos fenólicos y flavonoides con actividad antioxidante (Tabla 4.1). La stevia redujo los marcadores de estrés oxidativo cerebral en ratas alimentadas con una dieta alta en grasas y sacarosa [36], y los glucósidos de esteviol presentan actividad antioxidante [37], revirtieron el deterioro de la memoria inducido por escopolamina [38] y modularon la plasticidad sináptica hipocampal en un modelo de desorden metabólico [39]. Estas propiedades podrían contribuir a que la stevia no produjera un deterioro sostenido de la memoria de reconocimiento.</w:t>
       </w:r>
     </w:p>
     <w:bookmarkEnd w:id="86"/>
@@ -15723,7 +15656,7 @@
         <w:pStyle w:val="FirstParagraph"/>
       </w:pPr>
       <w:r>
-        <w:t xml:space="preserve">En la SLR, los animales expuestos a sacarosa durante la etapa juvenil discriminaron peor la posición novedosa en ambas configuraciones, mientras que los expuestos durante la adultez lo hicieron solo en la s-SLR, la configuración de mayor demanda de separación de patrones (§5.4). Este patrón concuerda con el de Reichelt et al., quienes encontraron que las ratas con acceso diario a sacarosa discriminaron la nueva ubicación de un objeto cuando la separación espacial era grande, pero no cuando era pequeña [11]. También concuerda con la alteración selectiva de la memoria de lugar descripta tras una exposición breve a azúcar [39, 40] y con el deterioro de la separación de patrones asociado a una menor neurogénesis tras una alteración nutricional temprana [9]. Que en los adultos el déficit apareciera solo en la configuración más exigente sugiere que la exposición adulta a sacarosa compromete específicamente la separación de patrones, mientras que la exposición juvenil produce una alteración más amplia de la memoria espacial.</w:t>
+        <w:t xml:space="preserve">En la SLR, los animales expuestos a sacarosa durante la etapa juvenil discriminaron peor la posición novedosa en ambas configuraciones, mientras que los expuestos durante la adultez lo hicieron solo en la s-SLR, la configuración de mayor demanda de separación de patrones (§5.4). Este patrón concuerda con el de Reichelt et al., quienes encontraron que las ratas con acceso diario a sacarosa discriminaron la nueva ubicación de un objeto cuando la separación espacial era grande, pero no cuando era pequeña [11]. También concuerda con la alteración selectiva de la memoria de lugar descripta tras una exposición breve a azúcar [40, 41] y con el deterioro de la separación de patrones asociado a una menor neurogénesis tras una alteración nutricional temprana [9]. Que en los adultos el déficit apareciera solo en la configuración más exigente sugiere que la exposición adulta a sacarosa compromete específicamente la separación de patrones, mientras que la exposición juvenil produce una alteración más amplia de la memoria espacial.</w:t>
       </w:r>
     </w:p>
     <w:p>
@@ -15781,7 +15714,7 @@
         <w:t xml:space="preserve"> </w:t>
       </w:r>
       <w:r>
-        <w:t xml:space="preserve">(§5.5). Estos resultados indican que la sacarosa afecta la etapa proliferativa del linaje neuronal [41] y que esa alteración persiste 25 días después de finalizado el consumo. Reichelt et al. también encontraron menos células PCNA</w:t>
+        <w:t xml:space="preserve">(§5.5). Estos resultados indican que la sacarosa afecta la etapa proliferativa del linaje neuronal [42] y que esa alteración persiste 25 días después de finalizado el consumo. Reichelt et al. también encontraron menos células PCNA</w:t>
       </w:r>
       <w:r>
         <w:rPr>
@@ -15817,7 +15750,7 @@
         <w:t xml:space="preserve"> </w:t>
       </w:r>
       <w:r>
-        <w:t xml:space="preserve">no se modificó, como en el trabajo de Xu y Reichelt, en el que la sacarosa sola no modificó la DCX del giro dentado [30]; esto podría indicar que, a largo plazo, la alteración se restringe a la etapa proliferativa. Además, en ratas hembra, el consumo de sacarosa al 25 % durante doce semanas a partir del destete redujo la expresión hipocampal de</w:t>
+        <w:t xml:space="preserve">no se modificó, como en el trabajo de Xu y Reichelt, en el que la sacarosa sola no modificó la DCX del giro dentado [31]; esto podría indicar que, a largo plazo, la alteración se restringe a la etapa proliferativa. Además, en ratas hembra, el consumo de sacarosa al 25 % durante doce semanas a partir del destete redujo la expresión hipocampal de</w:t>
       </w:r>
       <w:r>
         <w:t xml:space="preserve"> </w:t>
@@ -15830,7 +15763,7 @@
         <w:t xml:space="preserve">Neurod1</w:t>
       </w:r>
       <w:r>
-        <w:t xml:space="preserve">, un gen vinculado a la diferenciación neuronal [42]. En cambio, Sánchez-Huerta et al. encontraron un aumento de la proliferación en la zona subgranular del giro dentado ventral tras el consumo de sacarosa iniciado en la adolescencia tardía [24], lo que sugiere que el efecto sobre la proliferación depende de la edad de inicio de la exposición.</w:t>
+        <w:t xml:space="preserve">, un gen vinculado a la diferenciación neuronal [43]. En cambio, Sánchez-Huerta et al. encontraron un aumento de la proliferación en la zona subgranular del giro dentado ventral tras el consumo de sacarosa iniciado en la adolescencia tardía [25], lo que sugiere que el efecto sobre la proliferación depende de la edad de inicio de la exposición.</w:t>
       </w:r>
     </w:p>
     <w:p>
@@ -15872,7 +15805,7 @@
         <w:t xml:space="preserve"> </w:t>
       </w:r>
       <w:r>
-        <w:t xml:space="preserve">(§6.3). Ni el clustering ni el clasificador encontraron grupos conductuales separados, y la exactitud del clasificador, superior al azar pero modesta, es la esperable para una intervención nutricional: en los trabajos que aplicaron Random Forest al fenotipado conductual, los grupos diferían por manipulaciones farmacológicas o genéticas de gran efecto [43, 44].</w:t>
+        <w:t xml:space="preserve">(§6.3). Ni el clustering ni el clasificador encontraron grupos conductuales separados, y la exactitud del clasificador, superior al azar pero modesta, es la esperable para una intervención nutricional: en los trabajos que aplicaron Random Forest al fenotipado conductual, los grupos diferían por manipulaciones farmacológicas o genéticas de gran efecto [44, 45].</w:t>
       </w:r>
     </w:p>
     <w:bookmarkEnd w:id="88"/>
@@ -16807,43 +16740,7 @@
         <w:rPr>
           <w:sz w:val="19"/>
         </w:rPr>
-        <w:t xml:space="preserve">[19] EFSA Panel on Food Additives and Nutrient Sources added to Food (ANS),</w:t>
-      </w:r>
-      <w:r>
-        <w:rPr>
-          <w:sz w:val="19"/>
-        </w:rPr>
-        <w:t xml:space="preserve"> </w:t>
-      </w:r>
-      <w:r>
-        <w:rPr>
-          <w:sz w:val="19"/>
-        </w:rPr>
-        <w:t xml:space="preserve">“</w:t>
-      </w:r>
-      <w:r>
-        <w:rPr>
-          <w:sz w:val="19"/>
-        </w:rPr>
-        <w:t xml:space="preserve">Scientific opinion on the safety of steviol glycosides for the proposed uses as a food additive,</w:t>
-      </w:r>
-      <w:r>
-        <w:rPr>
-          <w:sz w:val="19"/>
-        </w:rPr>
-        <w:t xml:space="preserve">”</w:t>
-      </w:r>
-      <w:r>
-        <w:rPr>
-          <w:sz w:val="19"/>
-        </w:rPr>
-        <w:t xml:space="preserve"> </w:t>
-      </w:r>
-      <w:r>
-        <w:rPr>
-          <w:sz w:val="19"/>
-        </w:rPr>
-        <w:t xml:space="preserve">EFSA J., vol. 8, no. 4, 2010, Art. no. 1537. doi: 10.2903/j.efsa.2010.1537</w:t>
+        <w:t xml:space="preserve">[19] World Health Organization, Guideline: Sugars intake for adults and children. Geneva, Switzerland: World Health Organization, 2015, isbn: 978-92-4-154902-8. [Online]. Available: https://www.who.int/publications/i/item/9789241549028</w:t>
       </w:r>
     </w:p>
     <w:p>
@@ -16856,7 +16753,7 @@
         <w:rPr>
           <w:sz w:val="19"/>
         </w:rPr>
-        <w:t xml:space="preserve">[20] A. G. Yunker, R. Patel, and K. A. Page,</w:t>
+        <w:t xml:space="preserve">[20] EFSA Panel on Food Additives and Nutrient Sources added to Food (ANS),</w:t>
       </w:r>
       <w:r>
         <w:rPr>
@@ -16874,7 +16771,7 @@
         <w:rPr>
           <w:sz w:val="19"/>
         </w:rPr>
-        <w:t xml:space="preserve">Effects of non-nutritive sweeteners on sweet taste processing and neuroendocrine regulation of eating behavior,</w:t>
+        <w:t xml:space="preserve">Scientific opinion on the safety of steviol glycosides for the proposed uses as a food additive,</w:t>
       </w:r>
       <w:r>
         <w:rPr>
@@ -16892,7 +16789,7 @@
         <w:rPr>
           <w:sz w:val="19"/>
         </w:rPr>
-        <w:t xml:space="preserve">Curr. Nutr. Rep., vol. 9, no. 3, pp. 278–289, Sep. 2020. doi: 10.1007/s13668-020-00323-3 [Online]. Available: https://pubmed.ncbi.nlm.nih.gov/32588329/</w:t>
+        <w:t xml:space="preserve">EFSA J., vol. 8, no. 4, 2010, Art. no. 1537. doi: 10.2903/j.efsa.2010.1537</w:t>
       </w:r>
     </w:p>
     <w:p>
@@ -16905,7 +16802,7 @@
         <w:rPr>
           <w:sz w:val="19"/>
         </w:rPr>
-        <w:t xml:space="preserve">[21] I. D. Salinas-Velarde et al.,</w:t>
+        <w:t xml:space="preserve">[21] A. G. Yunker, R. Patel, and K. A. Page,</w:t>
       </w:r>
       <w:r>
         <w:rPr>
@@ -16923,7 +16820,7 @@
         <w:rPr>
           <w:sz w:val="19"/>
         </w:rPr>
-        <w:t xml:space="preserve">Lower ΔFosB expression in the dopaminergic system after stevia consumption in rats housed under environmental enrichment conditions,</w:t>
+        <w:t xml:space="preserve">Effects of non-nutritive sweeteners on sweet taste processing and neuroendocrine regulation of eating behavior,</w:t>
       </w:r>
       <w:r>
         <w:rPr>
@@ -16941,7 +16838,7 @@
         <w:rPr>
           <w:sz w:val="19"/>
         </w:rPr>
-        <w:t xml:space="preserve">Brain Res. Bull., vol. 177, pp. 172–180, 2021. doi: 10.1016/j.brainresbull.2021.10.001</w:t>
+        <w:t xml:space="preserve">Curr. Nutr. Rep., vol. 9, no. 3, pp. 278–289, Sep. 2020. doi: 10.1007/s13668-020-00323-3 [Online]. Available: https://pubmed.ncbi.nlm.nih.gov/32588329/</w:t>
       </w:r>
     </w:p>
     <w:p>
@@ -16954,7 +16851,7 @@
         <w:rPr>
           <w:sz w:val="19"/>
         </w:rPr>
-        <w:t xml:space="preserve">[22] H. Coirini, M. Rey, A. Marchena, P. Lence, and M. S. Kruse,</w:t>
+        <w:t xml:space="preserve">[22] I. D. Salinas-Velarde et al.,</w:t>
       </w:r>
       <w:r>
         <w:rPr>
@@ -16972,7 +16869,7 @@
         <w:rPr>
           <w:sz w:val="19"/>
         </w:rPr>
-        <w:t xml:space="preserve">Stevia vs. sucrose consumption: influence on the behavior of juvenile rats,</w:t>
+        <w:t xml:space="preserve">Lower ΔFosB expression in the dopaminergic system after stevia consumption in rats housed under environmental enrichment conditions,</w:t>
       </w:r>
       <w:r>
         <w:rPr>
@@ -16990,7 +16887,7 @@
         <w:rPr>
           <w:sz w:val="19"/>
         </w:rPr>
-        <w:t xml:space="preserve">Medicina (B. Aires), vol. 83, no. Supl. V, p. 148, 2023, Resumen 182, Reunión Conjunta SAIC SAB AAFE AACYTAL 2023, Mar del Plata, Argentina.</w:t>
+        <w:t xml:space="preserve">Brain Res. Bull., vol. 177, pp. 172–180, 2021. doi: 10.1016/j.brainresbull.2021.10.001</w:t>
       </w:r>
     </w:p>
     <w:p>
@@ -17003,7 +16900,7 @@
         <w:rPr>
           <w:sz w:val="19"/>
         </w:rPr>
-        <w:t xml:space="preserve">[23] A. Marchena et al.,</w:t>
+        <w:t xml:space="preserve">[23] H. Coirini, M. Rey, A. Marchena, P. Lence, and M. S. Kruse,</w:t>
       </w:r>
       <w:r>
         <w:rPr>
@@ -17021,7 +16918,7 @@
         <w:rPr>
           <w:sz w:val="19"/>
         </w:rPr>
-        <w:t xml:space="preserve">Early-life stevia and sucrose consumption differentially affect metabolic homeostasis and neurobiological outcomes in rats,</w:t>
+        <w:t xml:space="preserve">Stevia vs. sucrose consumption: influence on the behavior of juvenile rats,</w:t>
       </w:r>
       <w:r>
         <w:rPr>
@@ -17039,7 +16936,7 @@
         <w:rPr>
           <w:sz w:val="19"/>
         </w:rPr>
-        <w:t xml:space="preserve">Manuscrito enviado para publicación.</w:t>
+        <w:t xml:space="preserve">Medicina (B. Aires), vol. 83, no. Supl. V, p. 148, 2023, Resumen 182, Reunión Conjunta SAIC SAB AAFE AACYTAL 2023, Mar del Plata, Argentina.</w:t>
       </w:r>
     </w:p>
     <w:p>
@@ -17052,7 +16949,7 @@
         <w:rPr>
           <w:sz w:val="19"/>
         </w:rPr>
-        <w:t xml:space="preserve">[24] K. Sánchez-Huerta et al.,</w:t>
+        <w:t xml:space="preserve">[24] A. Marchena, M. Rey, M. C. González Deniselle, H. Coirini, and M. S. Kruse,</w:t>
       </w:r>
       <w:r>
         <w:rPr>
@@ -17070,7 +16967,7 @@
         <w:rPr>
           <w:sz w:val="19"/>
         </w:rPr>
-        <w:t xml:space="preserve">Sucrose consumption during late adolescence impairs adult neurogenesis of the ventral dentate gyrus without inducing an anxiety-like behavior,</w:t>
+        <w:t xml:space="preserve">Stevia vs. sucrose consumption: influence on the behavior of juvenile rats,</w:t>
       </w:r>
       <w:r>
         <w:rPr>
@@ -17088,7 +16985,7 @@
         <w:rPr>
           <w:sz w:val="19"/>
         </w:rPr>
-        <w:t xml:space="preserve">Int. J. Mol. Sci., vol. 23, no. 22, Nov. 2022, Art. no. 14176. doi: 10.3390/ijms232214176 [Online].Available: https://www.ncbi.nlm.nih.gov/pmc/articles/PMC9695980/</w:t>
+        <w:t xml:space="preserve">En revisión en J. Nutr. (JN-2025-2424_R2), 2025.</w:t>
       </w:r>
     </w:p>
     <w:p>
@@ -17101,7 +16998,7 @@
         <w:rPr>
           <w:sz w:val="19"/>
         </w:rPr>
-        <w:t xml:space="preserve">[25] J. L. Rico, L. Aya-Ramos, and Z. Dueñas,</w:t>
+        <w:t xml:space="preserve">[25] K. Sánchez-Huerta et al.,</w:t>
       </w:r>
       <w:r>
         <w:rPr>
@@ -17119,7 +17016,7 @@
         <w:rPr>
           <w:sz w:val="19"/>
         </w:rPr>
-        <w:t xml:space="preserve">Effects of early-life stress followed by access to stevia or sucralose during adolescence on weight gain, glycemia, and anxiety-related behaviors in male and female rats,</w:t>
+        <w:t xml:space="preserve">Sucrose consumption during late adolescence impairs adult neurogenesis of the ventral dentate gyrus without inducing an anxiety-like behavior,</w:t>
       </w:r>
       <w:r>
         <w:rPr>
@@ -17137,7 +17034,7 @@
         <w:rPr>
           <w:sz w:val="19"/>
         </w:rPr>
-        <w:t xml:space="preserve">Physiol. Behav., vol. 280, 2024, Art. no. 114529. doi: 10.1016/j.physbeh.2024.114529</w:t>
+        <w:t xml:space="preserve">Int. J. Mol. Sci., vol. 23, no. 22, Nov. 2022, Art. no. 14176. doi: 10.3390/ijms232214176 [Online].Available: https://www.ncbi.nlm.nih.gov/pmc/articles/PMC9695980/</w:t>
       </w:r>
     </w:p>
     <w:p>
@@ -17150,7 +17047,7 @@
         <w:rPr>
           <w:sz w:val="19"/>
         </w:rPr>
-        <w:t xml:space="preserve">[26] F. Khakpai, M. Naseroleslami, M. Moheb-Alian, E. Ghanimati, F. Abdollah-pour, and N. Mousavi-Niri,</w:t>
+        <w:t xml:space="preserve">[26] J. L. Rico, L. Aya-Ramos, and Z. Dueñas,</w:t>
       </w:r>
       <w:r>
         <w:rPr>
@@ -17168,7 +17065,7 @@
         <w:rPr>
           <w:sz w:val="19"/>
         </w:rPr>
-        <w:t xml:space="preserve">Intra-gastrically administration of Stevia and particularly Nano-Stevia reversed the hyperglycemia, anxiety, and memory impairment in streptozotocin-induced diabetic rats,</w:t>
+        <w:t xml:space="preserve">Effects of early-life stress followed by access to stevia or sucralose during adolescence on weight gain, glycemia, and anxiety-related behaviors in male and female rats,</w:t>
       </w:r>
       <w:r>
         <w:rPr>
@@ -17186,7 +17083,7 @@
         <w:rPr>
           <w:sz w:val="19"/>
         </w:rPr>
-        <w:t xml:space="preserve">Physiol. Behav., vol. 263, 2023, Art. no. 114100. doi: 10.1016/j.physbeh.2023.114100</w:t>
+        <w:t xml:space="preserve">Physiol. Behav., vol. 280, 2024, Art. no. 114529. doi: 10.1016/j.physbeh.2024.114529</w:t>
       </w:r>
     </w:p>
     <w:p>
@@ -17199,7 +17096,7 @@
         <w:rPr>
           <w:sz w:val="19"/>
         </w:rPr>
-        <w:t xml:space="preserve">[27] D. Bosch and I. Ehrlich,</w:t>
+        <w:t xml:space="preserve">[27] F. Khakpai, M. Naseroleslami, M. Moheb-Alian, E. Ghanimati, F. Abdollah-pour, and N. Mousavi-Niri,</w:t>
       </w:r>
       <w:r>
         <w:rPr>
@@ -17217,7 +17114,7 @@
         <w:rPr>
           <w:sz w:val="19"/>
         </w:rPr>
-        <w:t xml:space="preserve">Postnatal maturation of GABAergic modulation of sensory inputs onto lateral amygdala principal neurons,</w:t>
+        <w:t xml:space="preserve">Intra-gastrically administration of Stevia and particularly Nano-Stevia reversed the hyperglycemia, anxiety, and memory impairment in streptozotocin-induced diabetic rats,</w:t>
       </w:r>
       <w:r>
         <w:rPr>
@@ -17235,7 +17132,7 @@
         <w:rPr>
           <w:sz w:val="19"/>
         </w:rPr>
-        <w:t xml:space="preserve">J. Physiol., vol. 593, no. 19, pp. 4387–4409, 2015. doi: 10.1113/JP270645</w:t>
+        <w:t xml:space="preserve">Physiol. Behav., vol. 263, 2023, Art. no. 114100. doi: 10.1016/j.physbeh.2023.114100</w:t>
       </w:r>
     </w:p>
     <w:p>
@@ -17248,7 +17145,7 @@
         <w:rPr>
           <w:sz w:val="19"/>
         </w:rPr>
-        <w:t xml:space="preserve">[28] N. Ognjanovski et al.,</w:t>
+        <w:t xml:space="preserve">[28] D. Bosch and I. Ehrlich,</w:t>
       </w:r>
       <w:r>
         <w:rPr>
@@ -17266,7 +17163,7 @@
         <w:rPr>
           <w:sz w:val="19"/>
         </w:rPr>
-        <w:t xml:space="preserve">Parvalbumin-expressing interneurons coordinate hippocampal network dynamics required for memory consolidation,</w:t>
+        <w:t xml:space="preserve">Postnatal maturation of GABAergic modulation of sensory inputs onto lateral amygdala principal neurons,</w:t>
       </w:r>
       <w:r>
         <w:rPr>
@@ -17284,7 +17181,7 @@
         <w:rPr>
           <w:sz w:val="19"/>
         </w:rPr>
-        <w:t xml:space="preserve">Nat. Commun., vol. 8, 2017, Art. no. 15039. doi: 10.1038/ncomms15039</w:t>
+        <w:t xml:space="preserve">J. Physiol., vol. 593, no. 19, pp. 4387–4409, 2015. doi: 10.1113/JP270645</w:t>
       </w:r>
     </w:p>
     <w:p>
@@ -17297,7 +17194,7 @@
         <w:rPr>
           <w:sz w:val="19"/>
         </w:rPr>
-        <w:t xml:space="preserve">[29] A. C. Reichelt, S. Killcross, L. D. Hambly, M. J. Morris, and R. F. Westbrook,</w:t>
+        <w:t xml:space="preserve">[29] N. Ognjanovski et al.,</w:t>
       </w:r>
       <w:r>
         <w:rPr>
@@ -17315,7 +17212,7 @@
         <w:rPr>
           <w:sz w:val="19"/>
         </w:rPr>
-        <w:t xml:space="preserve">Impact of adolescent sucrose access on cognitive control, recognition memory, and parvalbumin immunoreactivity,</w:t>
+        <w:t xml:space="preserve">Parvalbumin-expressing interneurons coordinate hippocampal network dynamics required for memory consolidation,</w:t>
       </w:r>
       <w:r>
         <w:rPr>
@@ -17333,7 +17230,7 @@
         <w:rPr>
           <w:sz w:val="19"/>
         </w:rPr>
-        <w:t xml:space="preserve">Learn. Mem., vol. 22, no. 4, pp. 215–224, 2015. doi: 10.1101/lm.038000.114</w:t>
+        <w:t xml:space="preserve">Nat. Commun., vol. 8, 2017, Art. no. 15039. doi: 10.1038/ncomms15039</w:t>
       </w:r>
     </w:p>
     <w:p>
@@ -17346,7 +17243,7 @@
         <w:rPr>
           <w:sz w:val="19"/>
         </w:rPr>
-        <w:t xml:space="preserve">[30] T. J. Xu and A. C. Reichelt,</w:t>
+        <w:t xml:space="preserve">[30] A. C. Reichelt, S. Killcross, L. D. Hambly, M. J. Morris, and R. F. Westbrook,</w:t>
       </w:r>
       <w:r>
         <w:rPr>
@@ -17364,7 +17261,7 @@
         <w:rPr>
           <w:sz w:val="19"/>
         </w:rPr>
-        <w:t xml:space="preserve">Sucrose or sucrose and caffeine differentially impact memory and anxiety-like behaviours, and alter hippocampal parvalbumin and doublecortin,</w:t>
+        <w:t xml:space="preserve">Impact of adolescent sucrose access on cognitive control, recognition memory, and parvalbumin immunoreactivity,</w:t>
       </w:r>
       <w:r>
         <w:rPr>
@@ -17382,7 +17279,7 @@
         <w:rPr>
           <w:sz w:val="19"/>
         </w:rPr>
-        <w:t xml:space="preserve">Neuropharmacology, vol. 137, pp. 24–32, 2018. doi: 10.1016/j.neuropharm.2018.04.012</w:t>
+        <w:t xml:space="preserve">Learn. Mem., vol. 22, no. 4, pp. 215–224, 2015. doi: 10.1101/lm.038000.114</w:t>
       </w:r>
     </w:p>
     <w:p>
@@ -17395,7 +17292,7 @@
         <w:rPr>
           <w:sz w:val="19"/>
         </w:rPr>
-        <w:t xml:space="preserve">[31] A. C. Reichelt, G. D. Gibson, K. N. Abbott, and D. J. Hare,</w:t>
+        <w:t xml:space="preserve">[31] T. J. Xu and A. C. Reichelt,</w:t>
       </w:r>
       <w:r>
         <w:rPr>
@@ -17413,7 +17310,7 @@
         <w:rPr>
           <w:sz w:val="19"/>
         </w:rPr>
-        <w:t xml:space="preserve">A high-fat high-sugar diet in adolescent rats impairs social memory and alters chemical markers characteristic of atypical neuroplasticity and parvalbumin interneuron depletion in the medial prefrontal cortex,</w:t>
+        <w:t xml:space="preserve">Sucrose or sucrose and caffeine differentially impact memory and anxiety-like behaviours, and alter hippocampal parvalbumin and doublecortin,</w:t>
       </w:r>
       <w:r>
         <w:rPr>
@@ -17431,7 +17328,7 @@
         <w:rPr>
           <w:sz w:val="19"/>
         </w:rPr>
-        <w:t xml:space="preserve">Food Funct., vol. 10, no. 4, pp. 1985–1998, 2019. doi: 10.1039/c8fo02118j</w:t>
+        <w:t xml:space="preserve">Neuropharmacology, vol. 137, pp. 24–32, 2018. doi: 10.1016/j.neuropharm.2018.04.012</w:t>
       </w:r>
     </w:p>
     <w:p>
@@ -17444,7 +17341,7 @@
         <w:rPr>
           <w:sz w:val="19"/>
         </w:rPr>
-        <w:t xml:space="preserve">[32] E. I. Morales-Ríos, J. García-Machorro, A. Briones-Aranda, R. Gómez-Pliego, and J. Espinosa-Raya,</w:t>
+        <w:t xml:space="preserve">[32] A. C. Reichelt, G. D. Gibson, K. N. Abbott, and D. J. Hare,</w:t>
       </w:r>
       <w:r>
         <w:rPr>
@@ -17462,7 +17359,7 @@
         <w:rPr>
           <w:sz w:val="19"/>
         </w:rPr>
-        <w:t xml:space="preserve">Effect of long-term intake of nutritive and non-nutritive sweeteners on metabolic health and cognition in adult male rats,</w:t>
+        <w:t xml:space="preserve">A high-fat high-sugar diet in adolescent rats impairs social memory and alters chemical markers characteristic of atypical neuroplasticity and parvalbumin interneuron depletion in the medial prefrontal cortex,</w:t>
       </w:r>
       <w:r>
         <w:rPr>
@@ -17480,7 +17377,7 @@
         <w:rPr>
           <w:sz w:val="19"/>
         </w:rPr>
-        <w:t xml:space="preserve">J. Med. Food, vol. 25, no. 11, pp. 1059–1065, 2022. doi: 10.1089/jmf.2022.0016</w:t>
+        <w:t xml:space="preserve">Food Funct., vol. 10, no. 4, pp. 1985–1998, 2019. doi: 10.1039/c8fo02118j</w:t>
       </w:r>
     </w:p>
     <w:p>
@@ -17493,7 +17390,7 @@
         <w:rPr>
           <w:sz w:val="19"/>
         </w:rPr>
-        <w:t xml:space="preserve">[33] L. Tsan et al.,</w:t>
+        <w:t xml:space="preserve">[33] E. I. Morales-Ríos, J. García-Machorro, A. Briones-Aranda, R. Gómez-Pliego, and J. Espinosa-Raya,</w:t>
       </w:r>
       <w:r>
         <w:rPr>
@@ -17511,7 +17408,7 @@
         <w:rPr>
           <w:sz w:val="19"/>
         </w:rPr>
-        <w:t xml:space="preserve">Early-life low-calorie sweetener consumption disrupts glucose regulation, sugar-motivated behavior, and memory function in rats,</w:t>
+        <w:t xml:space="preserve">Effect of long-term intake of nutritive and non-nutritive sweeteners on metabolic health and cognition in adult male rats,</w:t>
       </w:r>
       <w:r>
         <w:rPr>
@@ -17529,7 +17426,7 @@
         <w:rPr>
           <w:sz w:val="19"/>
         </w:rPr>
-        <w:t xml:space="preserve">JCI Insight, vol. 7, no. 20, Oct. 2022, Art. no. e157714. doi: 10.1172/jci.insight.157714 [Online]. Available: https://www.ncbi.nlm.nih.gov/pmc/articles/PMC9714783/</w:t>
+        <w:t xml:space="preserve">J. Med. Food, vol. 25, no. 11, pp. 1059–1065, 2022. doi: 10.1089/jmf.2022.0016</w:t>
       </w:r>
     </w:p>
     <w:p>
@@ -17542,7 +17439,7 @@
         <w:rPr>
           <w:sz w:val="19"/>
         </w:rPr>
-        <w:t xml:space="preserve">[34] A. L. de la Garza et al.,</w:t>
+        <w:t xml:space="preserve">[34] L. Tsan et al.,</w:t>
       </w:r>
       <w:r>
         <w:rPr>
@@ -17560,7 +17457,7 @@
         <w:rPr>
           <w:sz w:val="19"/>
         </w:rPr>
-        <w:t xml:space="preserve">Maternal sweeteners intake modulates gut microbiota and exacerbates learning and memory processes in adult male offspring,</w:t>
+        <w:t xml:space="preserve">Early-life low-calorie sweetener consumption disrupts glucose regulation, sugar-motivated behavior, and memory function in rats,</w:t>
       </w:r>
       <w:r>
         <w:rPr>
@@ -17578,7 +17475,7 @@
         <w:rPr>
           <w:sz w:val="19"/>
         </w:rPr>
-        <w:t xml:space="preserve">Front. Pediatr., vol. 9, Jan. 2022, Art. no. 746437. doi: 10.3389/fped.2021.746437</w:t>
+        <w:t xml:space="preserve">JCI Insight, vol. 7, no. 20, Oct. 2022, Art. no. e157714. doi: 10.1172/jci.insight.157714 [Online]. Available: https://www.ncbi.nlm.nih.gov/pmc/articles/PMC9714783/</w:t>
       </w:r>
     </w:p>
     <w:p>
@@ -17591,7 +17488,7 @@
         <w:rPr>
           <w:sz w:val="19"/>
         </w:rPr>
-        <w:t xml:space="preserve">[35] Y. Pozdnyakova and A. Murzatayeva,</w:t>
+        <w:t xml:space="preserve">[35] A. L. de la Garza et al.,</w:t>
       </w:r>
       <w:r>
         <w:rPr>
@@ -17609,7 +17506,7 @@
         <w:rPr>
           <w:sz w:val="19"/>
         </w:rPr>
-        <w:t xml:space="preserve">Neuroprotective potential of Stevia rebaudiana and Stachys sieboldii: Effects on oxidative stress and locomotor activity in male rats fed a high-fat, high-sucrose diet,</w:t>
+        <w:t xml:space="preserve">Maternal sweeteners intake modulates gut microbiota and exacerbates learning and memory processes in adult male offspring,</w:t>
       </w:r>
       <w:r>
         <w:rPr>
@@ -17627,7 +17524,7 @@
         <w:rPr>
           <w:sz w:val="19"/>
         </w:rPr>
-        <w:t xml:space="preserve">Biology (Basel), vol. 14, no. 4, Mar. 2025, Art. no. 359. doi: 10.3390/biology14040359 [Online]. Available: https://www.mdpi.com/2079-7737/14/4/359</w:t>
+        <w:t xml:space="preserve">Front. Pediatr., vol. 9, Jan. 2022, Art. no. 746437. doi: 10.3389/fped.2021.746437</w:t>
       </w:r>
     </w:p>
     <w:p>
@@ -17640,7 +17537,7 @@
         <w:rPr>
           <w:sz w:val="19"/>
         </w:rPr>
-        <w:t xml:space="preserve">[36] C. Prata et al.,</w:t>
+        <w:t xml:space="preserve">[36] Y. Pozdnyakova and A. Murzatayeva,</w:t>
       </w:r>
       <w:r>
         <w:rPr>
@@ -17658,7 +17555,7 @@
         <w:rPr>
           <w:sz w:val="19"/>
         </w:rPr>
-        <w:t xml:space="preserve">Glycosides from Stevia rebaudiana Bertoni possess insulin-mimetic and antioxidant activities in rat cardiac fibroblasts,</w:t>
+        <w:t xml:space="preserve">Neuroprotective potential of Stevia rebaudiana and Stachys sieboldii: Effects on oxidative stress and locomotor activity in male rats fed a high-fat, high-sucrose diet,</w:t>
       </w:r>
       <w:r>
         <w:rPr>
@@ -17676,7 +17573,7 @@
         <w:rPr>
           <w:sz w:val="19"/>
         </w:rPr>
-        <w:t xml:space="preserve">Oxid. Med. Cell. Longev., vol. 2017, Aug. 2017, Art. no. 3724545. doi: 10.1155/2017/3724545 [Online]. Available: https://www.ncbi.nlm.nih.gov/pmc/articles/PMC5602648/</w:t>
+        <w:t xml:space="preserve">Biology (Basel), vol. 14, no. 4, Mar. 2025, Art. no. 359. doi: 10.3390/biology14040359 [Online]. Available: https://www.mdpi.com/2079-7737/14/4/359</w:t>
       </w:r>
     </w:p>
     <w:p>
@@ -17689,7 +17586,7 @@
         <w:rPr>
           <w:sz w:val="19"/>
         </w:rPr>
-        <w:t xml:space="preserve">[37] D. Sharma, M. Puri, A. K. Tiwary, N. Singh, and A. S. Jaggi,</w:t>
+        <w:t xml:space="preserve">[37] C. Prata et al.,</w:t>
       </w:r>
       <w:r>
         <w:rPr>
@@ -17707,7 +17604,7 @@
         <w:rPr>
           <w:sz w:val="19"/>
         </w:rPr>
-        <w:t xml:space="preserve">Antiamnesic effect of stevioside in scopolamine-treated rats,</w:t>
+        <w:t xml:space="preserve">Glycosides from Stevia rebaudiana Bertoni possess insulin-mimetic and antioxidant activities in rat cardiac fibroblasts,</w:t>
       </w:r>
       <w:r>
         <w:rPr>
@@ -17725,7 +17622,7 @@
         <w:rPr>
           <w:sz w:val="19"/>
         </w:rPr>
-        <w:t xml:space="preserve">Indian J. Pharmacol., vol. 42, no. 3, pp. 164–167, 2010. doi: 10.4103/0253-7613.66840</w:t>
+        <w:t xml:space="preserve">Oxid. Med. Cell. Longev., vol. 2017, Aug. 2017, Art. no. 3724545. doi: 10.1155/2017/3724545 [Online]. Available: https://www.ncbi.nlm.nih.gov/pmc/articles/PMC5602648/</w:t>
       </w:r>
     </w:p>
     <w:p>
@@ -17738,7 +17635,7 @@
         <w:rPr>
           <w:sz w:val="19"/>
         </w:rPr>
-        <w:t xml:space="preserve">[38] V. A. Chavushyan et al.,</w:t>
+        <w:t xml:space="preserve">[38] D. Sharma, M. Puri, A. K. Tiwary, N. Singh, and A. S. Jaggi,</w:t>
       </w:r>
       <w:r>
         <w:rPr>
@@ -17756,7 +17653,7 @@
         <w:rPr>
           <w:sz w:val="19"/>
         </w:rPr>
-        <w:t xml:space="preserve">Effects of stevia on synaptic plasticity and NADPH oxidase level of CNS in conditions of metabolic disorders caused by fructose,</w:t>
+        <w:t xml:space="preserve">Antiamnesic effect of stevioside in scopolamine-treated rats,</w:t>
       </w:r>
       <w:r>
         <w:rPr>
@@ -17774,7 +17671,7 @@
         <w:rPr>
           <w:sz w:val="19"/>
         </w:rPr>
-        <w:t xml:space="preserve">BMC Complement. Altern. Med., vol. 17, Dec. 2017, Art. no. 540. doi: 10.1186/s12906-017-2049-9</w:t>
+        <w:t xml:space="preserve">Indian J. Pharmacol., vol. 42, no. 3, pp. 164–167, 2010. doi: 10.4103/0253-7613.66840</w:t>
       </w:r>
     </w:p>
     <w:p>
@@ -17787,7 +17684,7 @@
         <w:rPr>
           <w:sz w:val="19"/>
         </w:rPr>
-        <w:t xml:space="preserve">[39] J. E. Beilharz, J. Maniam, and M. J. Morris,</w:t>
+        <w:t xml:space="preserve">[39] V. A. Chavushyan et al.,</w:t>
       </w:r>
       <w:r>
         <w:rPr>
@@ -17805,7 +17702,7 @@
         <w:rPr>
           <w:sz w:val="19"/>
         </w:rPr>
-        <w:t xml:space="preserve">Short exposure to a diet rich in both fat and sugar or sugar alone impairs place, but not object recognition memory in rats,</w:t>
+        <w:t xml:space="preserve">Effects of stevia on synaptic plasticity and NADPH oxidase level of CNS in conditions of metabolic disorders caused by fructose,</w:t>
       </w:r>
       <w:r>
         <w:rPr>
@@ -17823,7 +17720,7 @@
         <w:rPr>
           <w:sz w:val="19"/>
         </w:rPr>
-        <w:t xml:space="preserve">Brain Behav. Immun., vol. 37, pp. 134–141, 2014. doi: 10.1016/j.bbi.2013.11.016</w:t>
+        <w:t xml:space="preserve">BMC Complement. Altern. Med., vol. 17, Dec. 2017, Art. no. 540. doi: 10.1186/s12906-017-2049-9</w:t>
       </w:r>
     </w:p>
     <w:p>
@@ -17854,7 +17751,7 @@
         <w:rPr>
           <w:sz w:val="19"/>
         </w:rPr>
-        <w:t xml:space="preserve">Short-term exposure to a diet high in fat and sugar, or liquid sugar, selectively impairs hippocampal-dependent memory, with differential impacts on inflammation,</w:t>
+        <w:t xml:space="preserve">Short exposure to a diet rich in both fat and sugar or sugar alone impairs place, but not object recognition memory in rats,</w:t>
       </w:r>
       <w:r>
         <w:rPr>
@@ -17872,7 +17769,7 @@
         <w:rPr>
           <w:sz w:val="19"/>
         </w:rPr>
-        <w:t xml:space="preserve">Behav. Brain Res., vol. 306, pp. 1–7, 2016. doi: 10.1016/j.bbr.2016.03.018</w:t>
+        <w:t xml:space="preserve">Brain Behav. Immun., vol. 37, pp. 134–141, 2014. doi: 10.1016/j.bbi.2013.11.016</w:t>
       </w:r>
     </w:p>
     <w:p>
@@ -17885,7 +17782,7 @@
         <w:rPr>
           <w:sz w:val="19"/>
         </w:rPr>
-        <w:t xml:space="preserve">[41] G. Kempermann, H. Song, and F. H. Gage,</w:t>
+        <w:t xml:space="preserve">[41] J. E. Beilharz, J. Maniam, and M. J. Morris,</w:t>
       </w:r>
       <w:r>
         <w:rPr>
@@ -17903,7 +17800,7 @@
         <w:rPr>
           <w:sz w:val="19"/>
         </w:rPr>
-        <w:t xml:space="preserve">Neurogenesis in the adult hippocampus,</w:t>
+        <w:t xml:space="preserve">Short-term exposure to a diet high in fat and sugar, or liquid sugar, selectively impairs hippocampal-dependent memory, with differential impacts on inflammation,</w:t>
       </w:r>
       <w:r>
         <w:rPr>
@@ -17921,7 +17818,7 @@
         <w:rPr>
           <w:sz w:val="19"/>
         </w:rPr>
-        <w:t xml:space="preserve">Cold Spring Harb. Perspect. Biol., vol. 7, no. 9, a018812, 2015. doi: 10.1101/cshperspect.a018812</w:t>
+        <w:t xml:space="preserve">Behav. Brain Res., vol. 306, pp. 1–7, 2016. doi: 10.1016/j.bbr.2016.03.018</w:t>
       </w:r>
     </w:p>
     <w:p>
@@ -17934,7 +17831,7 @@
         <w:rPr>
           <w:sz w:val="19"/>
         </w:rPr>
-        <w:t xml:space="preserve">[42] J. Maniam, C. P. Antoniadis, N. A. Youngson, J. K. Sinha, and M. J. Morris,</w:t>
+        <w:t xml:space="preserve">[42] G. Kempermann, H. Song, and F. H. Gage,</w:t>
       </w:r>
       <w:r>
         <w:rPr>
@@ -17952,7 +17849,7 @@
         <w:rPr>
           <w:sz w:val="19"/>
         </w:rPr>
-        <w:t xml:space="preserve">Sugar consumption produces effects similar to early life stress exposure on hippocampal markers of neurogenesis and stress response,</w:t>
+        <w:t xml:space="preserve">Neurogenesis in the adult hippocampus,</w:t>
       </w:r>
       <w:r>
         <w:rPr>
@@ -17970,7 +17867,7 @@
         <w:rPr>
           <w:sz w:val="19"/>
         </w:rPr>
-        <w:t xml:space="preserve">Front. Mol. Neurosci., vol. 8, Jan. 2016, Art. no. 86. doi: 10.3389/fnmol.2015.00086 [Online]. Available: https://www.ncbi.nlm.nih.gov/pmc/articles/PMC4717325/</w:t>
+        <w:t xml:space="preserve">Cold Spring Harb. Perspect. Biol., vol. 7, no. 9, a018812, 2015. doi: 10.1101/cshperspect.a018812</w:t>
       </w:r>
     </w:p>
     <w:p>
@@ -17983,7 +17880,7 @@
         <w:rPr>
           <w:sz w:val="19"/>
         </w:rPr>
-        <w:t xml:space="preserve">[43] D. A. Lukovikov et al.,</w:t>
+        <w:t xml:space="preserve">[43] J. Maniam, C. P. Antoniadis, N. A. Youngson, J. K. Sinha, and M. J. Morris,</w:t>
       </w:r>
       <w:r>
         <w:rPr>
@@ -18001,7 +17898,7 @@
         <w:rPr>
           <w:sz w:val="19"/>
         </w:rPr>
-        <w:t xml:space="preserve">Automated phenotyping of rodent behavior in the Cylinder Exploration Test using machine learning,</w:t>
+        <w:t xml:space="preserve">Sugar consumption produces effects similar to early life stress exposure on hippocampal markers of neurogenesis and stress response,</w:t>
       </w:r>
       <w:r>
         <w:rPr>
@@ -18019,7 +17916,7 @@
         <w:rPr>
           <w:sz w:val="19"/>
         </w:rPr>
-        <w:t xml:space="preserve">Neuroscience, vol. 601, pp. 169–178, May 2026. doi: 10.1016/j.neuroscience.2026.02.048 [Online]. Available: https://pubmed.ncbi.nlm.nih.gov/41780714/</w:t>
+        <w:t xml:space="preserve">Front. Mol. Neurosci., vol. 8, Jan. 2016, Art. no. 86. doi: 10.3389/fnmol.2015.00086 [Online]. Available: https://www.ncbi.nlm.nih.gov/pmc/articles/PMC4717325/</w:t>
       </w:r>
     </w:p>
     <w:p>
@@ -18032,7 +17929,56 @@
         <w:rPr>
           <w:sz w:val="19"/>
         </w:rPr>
-        <w:t xml:space="preserve">[44] A. Gerós, A. Magalhães, and P. Aguiar,</w:t>
+        <w:t xml:space="preserve">[44] D. A. Lukovikov et al.,</w:t>
+      </w:r>
+      <w:r>
+        <w:rPr>
+          <w:sz w:val="19"/>
+        </w:rPr>
+        <w:t xml:space="preserve"> </w:t>
+      </w:r>
+      <w:r>
+        <w:rPr>
+          <w:sz w:val="19"/>
+        </w:rPr>
+        <w:t xml:space="preserve">“</w:t>
+      </w:r>
+      <w:r>
+        <w:rPr>
+          <w:sz w:val="19"/>
+        </w:rPr>
+        <w:t xml:space="preserve">Automated phenotyping of rodent behavior in the Cylinder Exploration Test using machine learning,</w:t>
+      </w:r>
+      <w:r>
+        <w:rPr>
+          <w:sz w:val="19"/>
+        </w:rPr>
+        <w:t xml:space="preserve">”</w:t>
+      </w:r>
+      <w:r>
+        <w:rPr>
+          <w:sz w:val="19"/>
+        </w:rPr>
+        <w:t xml:space="preserve"> </w:t>
+      </w:r>
+      <w:r>
+        <w:rPr>
+          <w:sz w:val="19"/>
+        </w:rPr>
+        <w:t xml:space="preserve">Neuroscience, vol. 601, pp. 169–178, May 2026. doi: 10.1016/j.neuroscience.2026.02.048 [Online]. Available: https://pubmed.ncbi.nlm.nih.gov/41780714/</w:t>
+      </w:r>
+    </w:p>
+    <w:p>
+      <w:pPr>
+        <w:pStyle w:val="BodyText"/>
+        <w:spacing w:after="80"/>
+        <w:jc w:val="left"/>
+      </w:pPr>
+      <w:r>
+        <w:rPr>
+          <w:sz w:val="19"/>
+        </w:rPr>
+        <w:t xml:space="preserve">[45] A. Gerós, A. Magalhães, and P. Aguiar,</w:t>
       </w:r>
       <w:r>
         <w:rPr>
@@ -18081,72 +18027,7 @@
 </file>
 
 <file path=word/comments.xml><?xml version="1.0" encoding="utf-8"?>
-<w:comments xmlns:w="http://schemas.openxmlformats.org/wordprocessingml/2006/main" xmlns:m="http://schemas.openxmlformats.org/officeDocument/2006/math" xmlns:r="http://schemas.openxmlformats.org/officeDocument/2006/relationships" xmlns:o="urn:schemas-microsoft-com:office:office" xmlns:v="urn:schemas-microsoft-com:vml" xmlns:w10="urn:schemas-microsoft-com:office:word" xmlns:a="http://schemas.openxmlformats.org/drawingml/2006/main" xmlns:pic="http://schemas.openxmlformats.org/drawingml/2006/picture" xmlns:wp="http://schemas.openxmlformats.org/drawingml/2006/wordprocessingDrawing">
-  <w:comment w:id="0" w:author="Thiago Sayegh" w:initials="TS" w:date="2026-10-21T13:29:10Z">
-    <w:p>
-      <w:pPr>
-        <w:pStyle w:val="CommentText"/>
-      </w:pPr>
-      <w:r>
-        <w:rPr>
-          <w:rStyle w:val="CommentReference"/>
-        </w:rPr>
-        <w:annotationRef/>
-      </w:r>
-      <w:r>
-        <w:t>Pregunta 1. Lo de los valores diarios lo pude calcular solo para la stevia (IDA de EFSA, 4 mg/kg/día en equivalentes de esteviol): juveniles unas 5 veces la IDA y adultos 1,8 veces. Para la sacarosa haría falta el consumo de alimento de los adultos, así que lo saqué. Lo dejamos solo para la stevia?</w:t>
-      </w:r>
-    </w:p>
-  </w:comment>
-  <w:comment w:id="1" w:author="Thiago Sayegh" w:initials="TS" w:date="2026-10-21T13:29:10Z">
-    <w:p>
-      <w:pPr>
-        <w:pStyle w:val="CommentText"/>
-      </w:pPr>
-      <w:r>
-        <w:rPr>
-          <w:rStyle w:val="CommentReference"/>
-        </w:rPr>
-        <w:annotationRef/>
-      </w:r>
-      <w:r>
-        <w:t>Pregunta 2. Como presentación a congreso cité el resumen de la Reunión Conjunta SAIC-SAB 2023 (Coirini et al., Medicina 83, Supl. V, p. 148). Ahí dice stevia al 0,5 % y el manuscrito de Marchena dice 4 %. Es el mismo experimento? Si no, cuál cito?</w:t>
-      </w:r>
-    </w:p>
-  </w:comment>
-  <w:comment w:id="2" w:author="Thiago Sayegh" w:initials="TS" w:date="2026-10-21T13:29:10Z">
-    <w:p>
-      <w:pPr>
-        <w:pStyle w:val="CommentText"/>
-      </w:pPr>
-      <w:r>
-        <w:rPr>
-          <w:rStyle w:val="CommentReference"/>
-        </w:rPr>
-        <w:annotationRef/>
-      </w:r>
-      <w:r>
-        <w:t>Pregunta 3. Cité el manuscrito como "A. Marchena et al., manuscrito enviado para publicación". Me pasás los coautores y la revista?</w:t>
-      </w:r>
-    </w:p>
-  </w:comment>
-  <w:comment w:id="3" w:author="Thiago Sayegh" w:initials="TS" w:date="2026-10-21T13:29:10Z">
-    <w:p>
-      <w:pPr>
-        <w:pStyle w:val="CommentText"/>
-      </w:pPr>
-      <w:r>
-        <w:rPr>
-          <w:rStyle w:val="CommentReference"/>
-        </w:rPr>
-        <w:annotationRef/>
-      </w:r>
-      <w:r>
-        <w:t>Pregunta 4. En el estudio agudo la memoria se evaluó con NOL, así que cambié "memoria de reconocimiento a corto plazo" por "memoria de localización de objetos". Está bien?</w:t>
-      </w:r>
-    </w:p>
-  </w:comment>
-</w:comments>
+<w:comments xmlns:w="http://schemas.openxmlformats.org/wordprocessingml/2006/main" xmlns:m="http://schemas.openxmlformats.org/officeDocument/2006/math" xmlns:r="http://schemas.openxmlformats.org/officeDocument/2006/relationships" xmlns:o="urn:schemas-microsoft-com:office:office" xmlns:v="urn:schemas-microsoft-com:vml" xmlns:w10="urn:schemas-microsoft-com:office:word" xmlns:a="http://schemas.openxmlformats.org/drawingml/2006/main" xmlns:pic="http://schemas.openxmlformats.org/drawingml/2006/picture" xmlns:wp="http://schemas.openxmlformats.org/drawingml/2006/wordprocessingDrawing"/>
 </file>
 
 <file path=word/footnotes.xml><?xml version="1.0" encoding="utf-8"?>

</xml_diff>

<commit_message>
Documento corto para Sol con las secciones 1, 2, 3, 7 y 8; se saca la frase 'la unica para la que se dispuso...'
Co-Authored-By: Claude Opus 5.5 <noreply@anthropic.com>
</commit_message>
<xml_diff>
--- a/entregas/metodos resultados discusion 20261021.docx
+++ b/entregas/metodos resultados discusion 20261021.docx
@@ -1941,7 +1941,7 @@
         <w:pStyle w:val="FirstParagraph"/>
       </w:pPr>
       <w:r>
-        <w:t xml:space="preserve">El análisis multivariado se aplicó a la prueba SLR, la única para la que se dispuso de las métricas de AnyMaze© identificadas por animal. Se construyó una tabla con una fila por animal (</w:t>
+        <w:t xml:space="preserve">El análisis multivariado se aplicó a la prueba SLR. Se construyó una tabla con una fila por animal (</w:t>
       </w:r>
       <w:r>
         <w:rPr>
@@ -15168,7 +15168,7 @@
         <w:pStyle w:val="FirstParagraph"/>
       </w:pPr>
       <w:r>
-        <w:t xml:space="preserve">Se cumplieron los objetivos de mínima referidos al registro del consumo, a la conducta tipo ansiosa, a la memoria de reconocimiento y a la separación de patrones espaciales. El registro del peso corporal no llegó a incorporarse a los resultados, y la cuantificación de PCNA y DCX se completó en los grupos control y sacarosa, pero no en los grupos expuestos a stevia. Los objetivos de máxima se cumplieron sobre la prueba SLR, la única para la que se dispuso de las métricas de AnyMaze© identificadas por animal: el PCA y el clustering de Ward mostraron que los animales no se agrupan espontáneamente según su exposición, y el Random Forest predijo el grupo de cada animal por encima del azar, con el índice de discriminación como la variable de mayor importancia.</w:t>
+        <w:t xml:space="preserve">Se cumplieron los objetivos de mínima referidos al registro del consumo, a la conducta tipo ansiosa, a la memoria de reconocimiento y a la separación de patrones espaciales. El registro del peso corporal no llegó a incorporarse a los resultados, y la cuantificación de PCNA y DCX se completó en los grupos control y sacarosa, pero no en los grupos expuestos a stevia. Los objetivos de máxima se cumplieron sobre la prueba SLR: el PCA y el clustering de Ward mostraron que los animales no se agrupan espontáneamente según su exposición, y el Random Forest predijo el grupo de cada animal por encima del azar, con el índice de discriminación como la variable de mayor importancia.</w:t>
       </w:r>
     </w:p>
     <w:bookmarkEnd w:id="76"/>

</xml_diff>